<commit_message>
feat: enhance documentation for Maconomy to CaseWare Cloud integration; add detailed client guide and API usage feat: introduce XCM/CCH Axcess integration documentation; outline job discovery process and API endpoint
</commit_message>
<xml_diff>
--- a/backend/documentation/CaseWareCloudIntegration/client-caseware-cloud-integration.docx
+++ b/backend/documentation/CaseWareCloudIntegration/client-caseware-cloud-integration.docx
@@ -4,7 +4,8 @@
   <w:body>
     <w:p>
       <w:pPr>
-        <w:pStyle w:val="Heading1"/>
+        <w:pStyle w:val="Title"/>
+        <w:jc w:val="center"/>
       </w:pPr>
       <w:r>
         <w:t>Maconomy to CaseWare Cloud Integration</w:t>
@@ -12,15 +13,505 @@
     </w:p>
     <w:p>
       <w:pPr>
-        <w:pStyle w:val="Heading2"/>
+        <w:pStyle w:val="Heading1"/>
       </w:pPr>
       <w:r>
-        <w:t>Client guide</w:t>
+        <w:t>Contents</w:t>
+      </w:r>
+    </w:p>
+    <w:p>
+      <w:pPr>
+        <w:pStyle w:val="ListBullet"/>
+      </w:pPr>
+      <w:r>
+        <w:t>Integration scope and field coverage</w:t>
+      </w:r>
+    </w:p>
+    <w:p>
+      <w:pPr>
+        <w:pStyle w:val="ListBullet2"/>
+      </w:pPr>
+      <w:r>
+        <w:t>Maconomy fields in scope</w:t>
+      </w:r>
+    </w:p>
+    <w:p>
+      <w:pPr>
+        <w:pStyle w:val="ListBullet2"/>
+      </w:pPr>
+      <w:r>
+        <w:t>Scope boundaries</w:t>
+      </w:r>
+    </w:p>
+    <w:p>
+      <w:pPr>
+        <w:pStyle w:val="ListBullet"/>
+      </w:pPr>
+      <w:r>
+        <w:t>Integration workflow and behavior</w:t>
+      </w:r>
+    </w:p>
+    <w:p>
+      <w:pPr>
+        <w:pStyle w:val="ListBullet"/>
+      </w:pPr>
+      <w:r>
+        <w:t>How the integration starts</w:t>
+      </w:r>
+    </w:p>
+    <w:p>
+      <w:pPr>
+        <w:pStyle w:val="ListBullet"/>
+      </w:pPr>
+      <w:r>
+        <w:t>How jobs are selected</w:t>
+      </w:r>
+    </w:p>
+    <w:p>
+      <w:pPr>
+        <w:pStyle w:val="ListBullet"/>
+      </w:pPr>
+      <w:r>
+        <w:t>Maconomy data used in CaseWare Cloud</w:t>
+      </w:r>
+    </w:p>
+    <w:p>
+      <w:pPr>
+        <w:pStyle w:val="ListBullet"/>
+      </w:pPr>
+      <w:r>
+        <w:t>How the integration decides what to do</w:t>
+      </w:r>
+    </w:p>
+    <w:p>
+      <w:pPr>
+        <w:pStyle w:val="ListBullet"/>
+      </w:pPr>
+      <w:r>
+        <w:t>New job or missing CaseWare entity</w:t>
+      </w:r>
+    </w:p>
+    <w:p>
+      <w:pPr>
+        <w:pStyle w:val="ListBullet"/>
+      </w:pPr>
+      <w:r>
+        <w:t>Existing CaseWare entity</w:t>
+      </w:r>
+    </w:p>
+    <w:p>
+      <w:pPr>
+        <w:pStyle w:val="ListBullet"/>
+      </w:pPr>
+      <w:r>
+        <w:t>Maconomy updates</w:t>
+      </w:r>
+    </w:p>
+    <w:p>
+      <w:pPr>
+        <w:pStyle w:val="ListBullet"/>
+      </w:pPr>
+      <w:r>
+        <w:t>Authentication and reliability</w:t>
+      </w:r>
+    </w:p>
+    <w:p>
+      <w:pPr>
+        <w:pStyle w:val="ListBullet"/>
+      </w:pPr>
+      <w:r>
+        <w:t>Status and troubleshooting</w:t>
+      </w:r>
+    </w:p>
+    <w:p>
+      <w:pPr>
+        <w:pStyle w:val="ListBullet"/>
+      </w:pPr>
+      <w:r>
+        <w:t>Support sequence</w:t>
+      </w:r>
+    </w:p>
+    <w:p>
+      <w:pPr>
+        <w:pStyle w:val="Heading1"/>
+      </w:pPr>
+      <w:r>
+        <w:t>Integration scope and field coverage</w:t>
       </w:r>
     </w:p>
     <w:p>
       <w:r>
-        <w:t>This guide explains how an open Maconomy job is synchronized with CaseWare Cloud, how the two systems remain connected, and what happens when a job is created or changed.</w:t>
+        <w:t>This delivery synchronizes open Maconomy jobs with their corresponding CaseWare Cloud client entity and one business address. It supports scheduled processing of recently created or changed jobs and a manual, single-job retry. Maconomy is the source of truth; the local database only controls service activation and stores execution status for support.</w:t>
+      </w:r>
+    </w:p>
+    <w:p>
+      <w:pPr>
+        <w:pStyle w:val="Heading2"/>
+      </w:pPr>
+      <w:r>
+        <w:t>Maconomy fields in scope</w:t>
+      </w:r>
+    </w:p>
+    <w:tbl>
+      <w:tblPr>
+        <w:tblStyle w:val="TableGrid"/>
+        <w:tblW w:w="0" w:type="auto"/>
+        <w:tblLook w:val="04A0" w:firstRow="1" w:lastRow="0" w:firstColumn="1" w:lastColumn="0" w:noHBand="0" w:noVBand="1"/>
+      </w:tblPr>
+      <w:tblGrid>
+        <w:gridCol w:w="5040"/>
+        <w:gridCol w:w="5040"/>
+      </w:tblGrid>
+      <w:tr>
+        <w:tc>
+          <w:tcPr>
+            <w:tcW w:w="5040" w:type="dxa"/>
+            <w:shd w:val="clear" w:color="auto" w:fill="D9EAF7"/>
+          </w:tcPr>
+          <w:p>
+            <w:r>
+              <w:rPr>
+                <w:b/>
+                <w:sz w:val="18"/>
+              </w:rPr>
+              <w:t>Maconomy field</w:t>
+            </w:r>
+          </w:p>
+        </w:tc>
+        <w:tc>
+          <w:tcPr>
+            <w:tcW w:w="5040" w:type="dxa"/>
+            <w:shd w:val="clear" w:color="auto" w:fill="D9EAF7"/>
+          </w:tcPr>
+          <w:p>
+            <w:r>
+              <w:rPr>
+                <w:b/>
+                <w:sz w:val="18"/>
+              </w:rPr>
+              <w:t>Purpose in the integration</w:t>
+            </w:r>
+          </w:p>
+        </w:tc>
+      </w:tr>
+      <w:tr>
+        <w:tc>
+          <w:tcPr>
+            <w:tcW w:w="5040" w:type="dxa"/>
+          </w:tcPr>
+          <w:p>
+            <w:r>
+              <w:rPr>
+                <w:sz w:val="18"/>
+              </w:rPr>
+              <w:t>`jobnumber`</w:t>
+            </w:r>
+          </w:p>
+        </w:tc>
+        <w:tc>
+          <w:tcPr>
+            <w:tcW w:w="5040" w:type="dxa"/>
+          </w:tcPr>
+          <w:p>
+            <w:r>
+              <w:rPr>
+                <w:sz w:val="18"/>
+              </w:rPr>
+              <w:t>Finds the CaseWare entity using `VSKY-{jobnumber}`.</w:t>
+            </w:r>
+          </w:p>
+        </w:tc>
+      </w:tr>
+      <w:tr>
+        <w:tc>
+          <w:tcPr>
+            <w:tcW w:w="5040" w:type="dxa"/>
+          </w:tcPr>
+          <w:p>
+            <w:r>
+              <w:rPr>
+                <w:sz w:val="18"/>
+              </w:rPr>
+              <w:t>`jobname`</w:t>
+            </w:r>
+          </w:p>
+        </w:tc>
+        <w:tc>
+          <w:tcPr>
+            <w:tcW w:w="5040" w:type="dxa"/>
+          </w:tcPr>
+          <w:p>
+            <w:r>
+              <w:rPr>
+                <w:sz w:val="18"/>
+              </w:rPr>
+              <w:t>Sets the CaseWare entity name and operating name.</w:t>
+            </w:r>
+          </w:p>
+        </w:tc>
+      </w:tr>
+      <w:tr>
+        <w:tc>
+          <w:tcPr>
+            <w:tcW w:w="5040" w:type="dxa"/>
+          </w:tcPr>
+          <w:p>
+            <w:r>
+              <w:rPr>
+                <w:sz w:val="18"/>
+              </w:rPr>
+              <w:t>`name1`</w:t>
+            </w:r>
+          </w:p>
+        </w:tc>
+        <w:tc>
+          <w:tcPr>
+            <w:tcW w:w="5040" w:type="dxa"/>
+          </w:tcPr>
+          <w:p>
+            <w:r>
+              <w:rPr>
+                <w:sz w:val="18"/>
+              </w:rPr>
+              <w:t>Sets the address name.</w:t>
+            </w:r>
+          </w:p>
+        </w:tc>
+      </w:tr>
+      <w:tr>
+        <w:tc>
+          <w:tcPr>
+            <w:tcW w:w="5040" w:type="dxa"/>
+          </w:tcPr>
+          <w:p>
+            <w:r>
+              <w:rPr>
+                <w:sz w:val="18"/>
+              </w:rPr>
+              <w:t>`name2`, `name3`, `name4`</w:t>
+            </w:r>
+          </w:p>
+        </w:tc>
+        <w:tc>
+          <w:tcPr>
+            <w:tcW w:w="5040" w:type="dxa"/>
+          </w:tcPr>
+          <w:p>
+            <w:r>
+              <w:rPr>
+                <w:sz w:val="18"/>
+              </w:rPr>
+              <w:t>Set address lines 1, 2, and 3.</w:t>
+            </w:r>
+          </w:p>
+        </w:tc>
+      </w:tr>
+      <w:tr>
+        <w:tc>
+          <w:tcPr>
+            <w:tcW w:w="5040" w:type="dxa"/>
+          </w:tcPr>
+          <w:p>
+            <w:r>
+              <w:rPr>
+                <w:sz w:val="18"/>
+              </w:rPr>
+              <w:t>`postaldistrict`</w:t>
+            </w:r>
+          </w:p>
+        </w:tc>
+        <w:tc>
+          <w:tcPr>
+            <w:tcW w:w="5040" w:type="dxa"/>
+          </w:tcPr>
+          <w:p>
+            <w:r>
+              <w:rPr>
+                <w:sz w:val="18"/>
+              </w:rPr>
+              <w:t>Sets the address city.</w:t>
+            </w:r>
+          </w:p>
+        </w:tc>
+      </w:tr>
+      <w:tr>
+        <w:tc>
+          <w:tcPr>
+            <w:tcW w:w="5040" w:type="dxa"/>
+          </w:tcPr>
+          <w:p>
+            <w:r>
+              <w:rPr>
+                <w:sz w:val="18"/>
+              </w:rPr>
+              <w:t>`country`</w:t>
+            </w:r>
+          </w:p>
+        </w:tc>
+        <w:tc>
+          <w:tcPr>
+            <w:tcW w:w="5040" w:type="dxa"/>
+          </w:tcPr>
+          <w:p>
+            <w:r>
+              <w:rPr>
+                <w:sz w:val="18"/>
+              </w:rPr>
+              <w:t>Sets the address country.</w:t>
+            </w:r>
+          </w:p>
+        </w:tc>
+      </w:tr>
+      <w:tr>
+        <w:tc>
+          <w:tcPr>
+            <w:tcW w:w="5040" w:type="dxa"/>
+          </w:tcPr>
+          <w:p>
+            <w:r>
+              <w:rPr>
+                <w:sz w:val="18"/>
+              </w:rPr>
+              <w:t>`template`, `closed`</w:t>
+            </w:r>
+          </w:p>
+        </w:tc>
+        <w:tc>
+          <w:tcPr>
+            <w:tcW w:w="5040" w:type="dxa"/>
+          </w:tcPr>
+          <w:p>
+            <w:r>
+              <w:rPr>
+                <w:sz w:val="18"/>
+              </w:rPr>
+              <w:t>Exclude template and closed jobs.</w:t>
+            </w:r>
+          </w:p>
+        </w:tc>
+      </w:tr>
+      <w:tr>
+        <w:tc>
+          <w:tcPr>
+            <w:tcW w:w="5040" w:type="dxa"/>
+          </w:tcPr>
+          <w:p>
+            <w:r>
+              <w:rPr>
+                <w:sz w:val="18"/>
+              </w:rPr>
+              <w:t>`createddate`, `changeddate`</w:t>
+            </w:r>
+          </w:p>
+        </w:tc>
+        <w:tc>
+          <w:tcPr>
+            <w:tcW w:w="5040" w:type="dxa"/>
+          </w:tcPr>
+          <w:p>
+            <w:r>
+              <w:rPr>
+                <w:sz w:val="18"/>
+              </w:rPr>
+              <w:t>Select recent jobs for the scheduled run.</w:t>
+            </w:r>
+          </w:p>
+        </w:tc>
+      </w:tr>
+      <w:tr>
+        <w:tc>
+          <w:tcPr>
+            <w:tcW w:w="5040" w:type="dxa"/>
+          </w:tcPr>
+          <w:p>
+            <w:r>
+              <w:rPr>
+                <w:sz w:val="18"/>
+              </w:rPr>
+              <w:t>`versionnumber`</w:t>
+            </w:r>
+          </w:p>
+        </w:tc>
+        <w:tc>
+          <w:tcPr>
+            <w:tcW w:w="5040" w:type="dxa"/>
+          </w:tcPr>
+          <w:p>
+            <w:r>
+              <w:rPr>
+                <w:sz w:val="18"/>
+              </w:rPr>
+              <w:t>Determines whether CaseWare needs a newer version.</w:t>
+            </w:r>
+          </w:p>
+        </w:tc>
+      </w:tr>
+      <w:tr>
+        <w:tc>
+          <w:tcPr>
+            <w:tcW w:w="5040" w:type="dxa"/>
+          </w:tcPr>
+          <w:p>
+            <w:r>
+              <w:rPr>
+                <w:sz w:val="18"/>
+              </w:rPr>
+              <w:t>`text19`</w:t>
+            </w:r>
+          </w:p>
+        </w:tc>
+        <w:tc>
+          <w:tcPr>
+            <w:tcW w:w="5040" w:type="dxa"/>
+          </w:tcPr>
+          <w:p>
+            <w:r>
+              <w:rPr>
+                <w:sz w:val="18"/>
+              </w:rPr>
+              <w:t>Stores CaseWare IDs, numbers, synchronized version, and UTC timestamp.</w:t>
+            </w:r>
+          </w:p>
+        </w:tc>
+      </w:tr>
+    </w:tbl>
+    <w:p/>
+    <w:p>
+      <w:r>
+        <w:t>The integration applies the following standard CaseWare values: entity owner `Client`, entity type `A`, organization type `Corporation`, entity country code `US`, and address category `Business`.</w:t>
+      </w:r>
+    </w:p>
+    <w:p>
+      <w:pPr>
+        <w:pStyle w:val="Heading2"/>
+      </w:pPr>
+      <w:r>
+        <w:t>Scope boundaries</w:t>
+      </w:r>
+    </w:p>
+    <w:p>
+      <w:r>
+        <w:t xml:space="preserve">This delivery includes entity creation and updates, creation or updates of the single associated business address, Maconomy `text19` write-back, scheduled and manual triggers, version checks, token reuse, rate-limit handling, </w:t>
+      </w:r>
+      <w:r>
+        <w:lastRenderedPageBreak/>
+        <w:t>and status logging. It does not include other Maconomy record types, additional CaseWare modules or related records such as contacts, phones, emails, documents, workflow, or billing, changes to unrelated Maconomy business data, or changes to CaseWare screens. Any additional data or process can be assessed separately so that it receives clear requirements and delivery timing.</w:t>
+      </w:r>
+    </w:p>
+    <w:p>
+      <w:pPr>
+        <w:pStyle w:val="Heading1"/>
+      </w:pPr>
+      <w:r>
+        <w:t xml:space="preserve">Integration </w:t>
+      </w:r>
+      <w:r>
+        <w:t>workflow and behavior</w:t>
+      </w:r>
+    </w:p>
+    <w:p>
+      <w:r>
+        <w:t>This section explains how an in-scope Maconomy job is synchronized with CaseWare Cloud, how the two systems remain connected, and what happens when a job is created or changed.</w:t>
       </w:r>
     </w:p>
     <w:p>
@@ -41,15 +532,17 @@
     <w:p>
       <w:pPr>
         <w:pStyle w:val="NoSpacing"/>
+        <w:ind w:left="360"/>
       </w:pPr>
       <w:r>
         <w:rPr>
           <w:rFonts w:ascii="Consolas" w:hAnsi="Consolas"/>
-          <w:sz w:val="17"/>
+          <w:sz w:val="16"/>
         </w:rPr>
         <w:t>POST /api/v1/maconomy-caseware-cloud/sync-jobs</w:t>
       </w:r>
     </w:p>
+    <w:p/>
     <w:p>
       <w:r>
         <w:t>For a one-off synchronization, an authorized caller can use the separate job-number endpoint:</w:t>
@@ -58,18 +551,19 @@
     <w:p>
       <w:pPr>
         <w:pStyle w:val="NoSpacing"/>
+        <w:ind w:left="360"/>
       </w:pPr>
       <w:r>
         <w:rPr>
           <w:rFonts w:ascii="Consolas" w:hAnsi="Consolas"/>
-          <w:sz w:val="17"/>
+          <w:sz w:val="16"/>
         </w:rPr>
         <w:t>POST /api/v1/maconomy-caseware-cloud/sync-job</w:t>
       </w:r>
       <w:r>
         <w:rPr>
           <w:rFonts w:ascii="Consolas" w:hAnsi="Consolas"/>
-          <w:sz w:val="17"/>
+          <w:sz w:val="16"/>
         </w:rPr>
         <w:br/>
         <w:t>{</w:t>
@@ -77,7 +571,7 @@
       <w:r>
         <w:rPr>
           <w:rFonts w:ascii="Consolas" w:hAnsi="Consolas"/>
-          <w:sz w:val="17"/>
+          <w:sz w:val="16"/>
         </w:rPr>
         <w:br/>
         <w:t xml:space="preserve">  "jobnumber": "10105"</w:t>
@@ -85,12 +579,13 @@
       <w:r>
         <w:rPr>
           <w:rFonts w:ascii="Consolas" w:hAnsi="Consolas"/>
-          <w:sz w:val="17"/>
+          <w:sz w:val="16"/>
         </w:rPr>
         <w:br/>
         <w:t>}</w:t>
       </w:r>
     </w:p>
+    <w:p/>
     <w:p>
       <w:r>
         <w:t>This endpoint is intended for manual checking and recovery when a scheduled run reports a failed job. It reads and processes only the supplied Maconomy job; it does not process the rest of the job list. It applies the same create, map, update, address, checkpoint, version, and logging rules as the scheduled batch endpoint.</w:t>
@@ -103,10 +598,16 @@
     </w:p>
     <w:p>
       <w:pPr>
-        <w:pStyle w:val="Heading2"/>
+        <w:pStyle w:val="Heading1"/>
       </w:pPr>
       <w:r>
-        <w:t>How the integration starts</w:t>
+        <w:t xml:space="preserve">How </w:t>
+      </w:r>
+      <w:r>
+        <w:t>integration</w:t>
+      </w:r>
+      <w:r>
+        <w:t xml:space="preserve"> starts</w:t>
       </w:r>
     </w:p>
     <w:p>
@@ -126,9 +627,10 @@
     </w:p>
     <w:p>
       <w:pPr>
-        <w:pStyle w:val="Heading2"/>
+        <w:pStyle w:val="Heading1"/>
       </w:pPr>
       <w:r>
+        <w:lastRenderedPageBreak/>
         <w:t>How jobs are selected</w:t>
       </w:r>
     </w:p>
@@ -163,7 +665,6 @@
     </w:p>
     <w:p>
       <w:r>
-        <w:lastRenderedPageBreak/>
         <w:t>The response includes the job details needed to update CaseWare, including the job name, address fields, Maconomy version, and `text19`.</w:t>
       </w:r>
     </w:p>
@@ -176,8 +677,8 @@
           <w:noProof/>
         </w:rPr>
         <w:drawing>
-          <wp:inline distT="0" distB="0" distL="0" distR="0" wp14:anchorId="40D1AD99" wp14:editId="46FD970E">
-            <wp:extent cx="5943600" cy="2932963"/>
+          <wp:inline distT="0" distB="0" distL="0" distR="0" wp14:anchorId="5074CD75" wp14:editId="2BFAE336">
+            <wp:extent cx="5852160" cy="2887841"/>
             <wp:effectExtent l="0" t="0" r="0" b="0"/>
             <wp:docPr id="1" name="Picture 1"/>
             <wp:cNvGraphicFramePr>
@@ -199,7 +700,7 @@
                   <pic:spPr>
                     <a:xfrm>
                       <a:off x="0" y="0"/>
-                      <a:ext cx="5943600" cy="2932963"/>
+                      <a:ext cx="5852160" cy="2887841"/>
                     </a:xfrm>
                     <a:prstGeom prst="rect">
                       <a:avLst/>
@@ -217,9 +718,6 @@
         <w:jc w:val="center"/>
       </w:pPr>
       <w:r>
-        <w:rPr>
-          <w:i/>
-        </w:rPr>
         <w:t>Filled Maconomy New Job form</w:t>
       </w:r>
     </w:p>
@@ -237,8 +735,8 @@
           <w:noProof/>
         </w:rPr>
         <w:drawing>
-          <wp:inline distT="0" distB="0" distL="0" distR="0" wp14:anchorId="0998D113" wp14:editId="46998956">
-            <wp:extent cx="5943600" cy="2957730"/>
+          <wp:inline distT="0" distB="0" distL="0" distR="0" wp14:anchorId="52EB630F" wp14:editId="2B442B7D">
+            <wp:extent cx="5852160" cy="2912227"/>
             <wp:effectExtent l="0" t="0" r="0" b="0"/>
             <wp:docPr id="2" name="Picture 2"/>
             <wp:cNvGraphicFramePr>
@@ -260,7 +758,7 @@
                   <pic:spPr>
                     <a:xfrm>
                       <a:off x="0" y="0"/>
-                      <a:ext cx="5943600" cy="2957730"/>
+                      <a:ext cx="5852160" cy="2912227"/>
                     </a:xfrm>
                     <a:prstGeom prst="rect">
                       <a:avLst/>
@@ -278,14 +776,12 @@
         <w:jc w:val="center"/>
       </w:pPr>
       <w:r>
-        <w:rPr>
-          <w:i/>
-        </w:rPr>
         <w:t>Maconomy job Information tab after creation</w:t>
       </w:r>
     </w:p>
     <w:p>
       <w:r>
+        <w:lastRenderedPageBreak/>
         <w:t>The new job is then available in Maconomy's Job Home. The Information tab shows the created job number, job name, client, company, and other job details used by the integration.</w:t>
       </w:r>
     </w:p>
@@ -297,10 +793,9 @@
         <w:rPr>
           <w:noProof/>
         </w:rPr>
-        <w:lastRenderedPageBreak/>
         <w:drawing>
-          <wp:inline distT="0" distB="0" distL="0" distR="0" wp14:anchorId="0B36945E" wp14:editId="47E691BF">
-            <wp:extent cx="5943600" cy="2935995"/>
+          <wp:inline distT="0" distB="0" distL="0" distR="0" wp14:anchorId="7145299B" wp14:editId="055A1F4A">
+            <wp:extent cx="5852160" cy="2890826"/>
             <wp:effectExtent l="0" t="0" r="0" b="0"/>
             <wp:docPr id="3" name="Picture 3"/>
             <wp:cNvGraphicFramePr>
@@ -322,7 +817,7 @@
                   <pic:spPr>
                     <a:xfrm>
                       <a:off x="0" y="0"/>
-                      <a:ext cx="5943600" cy="2935995"/>
+                      <a:ext cx="5852160" cy="2890826"/>
                     </a:xfrm>
                     <a:prstGeom prst="rect">
                       <a:avLst/>
@@ -340,9 +835,6 @@
         <w:jc w:val="center"/>
       </w:pPr>
       <w:r>
-        <w:rPr>
-          <w:i/>
-        </w:rPr>
         <w:t>Maconomy job Customer tab after creation</w:t>
       </w:r>
     </w:p>
@@ -353,7 +845,7 @@
     </w:p>
     <w:p>
       <w:pPr>
-        <w:pStyle w:val="Heading2"/>
+        <w:pStyle w:val="Heading1"/>
       </w:pPr>
       <w:r>
         <w:t>Maconomy data used in CaseWare Cloud</w:t>
@@ -361,12 +853,18 @@
     </w:p>
     <w:p>
       <w:r>
-        <w:t>The integration reads information from the Maconomy job and sends it to two functional areas in CaseWare Cloud: the entity record and the entity address. The same values are used when an entity is created and when it is updated.</w:t>
+        <w:t xml:space="preserve">The integration reads information from the Maconomy job and sends it to two functional areas in CaseWare Cloud: the entity </w:t>
+      </w:r>
+      <w:r>
+        <w:t>record</w:t>
+      </w:r>
+      <w:r>
+        <w:t xml:space="preserve"> and the entity address. The same values are used when an entity is created and when it is updated.</w:t>
       </w:r>
     </w:p>
     <w:p>
       <w:pPr>
-        <w:pStyle w:val="Heading3"/>
+        <w:pStyle w:val="Heading2"/>
       </w:pPr>
       <w:r>
         <w:t>CaseWare entity</w:t>
@@ -379,7 +877,7 @@
     </w:p>
     <w:tbl>
       <w:tblPr>
-        <w:tblStyle w:val="LightShading-Accent1"/>
+        <w:tblStyle w:val="TableGrid"/>
         <w:tblW w:w="0" w:type="auto"/>
         <w:tblLook w:val="04A0" w:firstRow="1" w:lastRow="0" w:firstColumn="1" w:lastColumn="0" w:noHBand="0" w:noVBand="1"/>
       </w:tblPr>
@@ -389,16 +887,17 @@
         <w:gridCol w:w="3360"/>
       </w:tblGrid>
       <w:tr>
-        <w:trPr>
-          <w:cnfStyle w:val="100000000000" w:firstRow="1" w:lastRow="0" w:firstColumn="0" w:lastColumn="0" w:oddVBand="0" w:evenVBand="0" w:oddHBand="0" w:evenHBand="0" w:firstRowFirstColumn="0" w:firstRowLastColumn="0" w:lastRowFirstColumn="0" w:lastRowLastColumn="0"/>
-        </w:trPr>
         <w:tc>
           <w:tcPr>
-            <w:cnfStyle w:val="001000000000" w:firstRow="0" w:lastRow="0" w:firstColumn="1" w:lastColumn="0" w:oddVBand="0" w:evenVBand="0" w:oddHBand="0" w:evenHBand="0" w:firstRowFirstColumn="0" w:firstRowLastColumn="0" w:lastRowFirstColumn="0" w:lastRowLastColumn="0"/>
             <w:tcW w:w="3360" w:type="dxa"/>
+            <w:shd w:val="clear" w:color="auto" w:fill="D9EAF7"/>
           </w:tcPr>
           <w:p>
             <w:r>
+              <w:rPr>
+                <w:b/>
+                <w:sz w:val="18"/>
+              </w:rPr>
               <w:t>Maconomy information</w:t>
             </w:r>
           </w:p>
@@ -406,12 +905,14 @@
         <w:tc>
           <w:tcPr>
             <w:tcW w:w="3360" w:type="dxa"/>
+            <w:shd w:val="clear" w:color="auto" w:fill="D9EAF7"/>
           </w:tcPr>
           <w:p>
-            <w:pPr>
-              <w:cnfStyle w:val="100000000000" w:firstRow="1" w:lastRow="0" w:firstColumn="0" w:lastColumn="0" w:oddVBand="0" w:evenVBand="0" w:oddHBand="0" w:evenHBand="0" w:firstRowFirstColumn="0" w:firstRowLastColumn="0" w:lastRowFirstColumn="0" w:lastRowLastColumn="0"/>
-            </w:pPr>
             <w:r>
+              <w:rPr>
+                <w:b/>
+                <w:sz w:val="18"/>
+              </w:rPr>
               <w:t>CaseWare entity field</w:t>
             </w:r>
           </w:p>
@@ -419,28 +920,29 @@
         <w:tc>
           <w:tcPr>
             <w:tcW w:w="3360" w:type="dxa"/>
+            <w:shd w:val="clear" w:color="auto" w:fill="D9EAF7"/>
           </w:tcPr>
           <w:p>
-            <w:pPr>
-              <w:cnfStyle w:val="100000000000" w:firstRow="1" w:lastRow="0" w:firstColumn="0" w:lastColumn="0" w:oddVBand="0" w:evenVBand="0" w:oddHBand="0" w:evenHBand="0" w:firstRowFirstColumn="0" w:firstRowLastColumn="0" w:lastRowFirstColumn="0" w:lastRowLastColumn="0"/>
-            </w:pPr>
             <w:r>
+              <w:rPr>
+                <w:b/>
+                <w:sz w:val="18"/>
+              </w:rPr>
               <w:t>Functional meaning</w:t>
             </w:r>
           </w:p>
         </w:tc>
       </w:tr>
       <w:tr>
-        <w:trPr>
-          <w:cnfStyle w:val="000000100000" w:firstRow="0" w:lastRow="0" w:firstColumn="0" w:lastColumn="0" w:oddVBand="0" w:evenVBand="0" w:oddHBand="1" w:evenHBand="0" w:firstRowFirstColumn="0" w:firstRowLastColumn="0" w:lastRowFirstColumn="0" w:lastRowLastColumn="0"/>
-        </w:trPr>
         <w:tc>
           <w:tcPr>
-            <w:cnfStyle w:val="001000000000" w:firstRow="0" w:lastRow="0" w:firstColumn="1" w:lastColumn="0" w:oddVBand="0" w:evenVBand="0" w:oddHBand="0" w:evenHBand="0" w:firstRowFirstColumn="0" w:firstRowLastColumn="0" w:lastRowFirstColumn="0" w:lastRowLastColumn="0"/>
             <w:tcW w:w="3360" w:type="dxa"/>
           </w:tcPr>
           <w:p>
             <w:r>
+              <w:rPr>
+                <w:sz w:val="18"/>
+              </w:rPr>
               <w:t>Job Name (`jobname`)</w:t>
             </w:r>
           </w:p>
@@ -450,10 +952,10 @@
             <w:tcW w:w="3360" w:type="dxa"/>
           </w:tcPr>
           <w:p>
-            <w:pPr>
-              <w:cnfStyle w:val="000000100000" w:firstRow="0" w:lastRow="0" w:firstColumn="0" w:lastColumn="0" w:oddVBand="0" w:evenVBand="0" w:oddHBand="1" w:evenHBand="0" w:firstRowFirstColumn="0" w:firstRowLastColumn="0" w:lastRowFirstColumn="0" w:lastRowLastColumn="0"/>
-            </w:pPr>
             <w:r>
+              <w:rPr>
+                <w:sz w:val="18"/>
+              </w:rPr>
               <w:t>`Name`</w:t>
             </w:r>
           </w:p>
@@ -463,10 +965,10 @@
             <w:tcW w:w="3360" w:type="dxa"/>
           </w:tcPr>
           <w:p>
-            <w:pPr>
-              <w:cnfStyle w:val="000000100000" w:firstRow="0" w:lastRow="0" w:firstColumn="0" w:lastColumn="0" w:oddVBand="0" w:evenVBand="0" w:oddHBand="1" w:evenHBand="0" w:firstRowFirstColumn="0" w:firstRowLastColumn="0" w:lastRowFirstColumn="0" w:lastRowLastColumn="0"/>
-            </w:pPr>
             <w:r>
+              <w:rPr>
+                <w:sz w:val="18"/>
+              </w:rPr>
               <w:t>The name displayed for the client or organization.</w:t>
             </w:r>
           </w:p>
@@ -475,11 +977,13 @@
       <w:tr>
         <w:tc>
           <w:tcPr>
-            <w:cnfStyle w:val="001000000000" w:firstRow="0" w:lastRow="0" w:firstColumn="1" w:lastColumn="0" w:oddVBand="0" w:evenVBand="0" w:oddHBand="0" w:evenHBand="0" w:firstRowFirstColumn="0" w:firstRowLastColumn="0" w:lastRowFirstColumn="0" w:lastRowLastColumn="0"/>
             <w:tcW w:w="3360" w:type="dxa"/>
           </w:tcPr>
           <w:p>
             <w:r>
+              <w:rPr>
+                <w:sz w:val="18"/>
+              </w:rPr>
               <w:t>Job Name (`jobname`)</w:t>
             </w:r>
           </w:p>
@@ -489,10 +993,10 @@
             <w:tcW w:w="3360" w:type="dxa"/>
           </w:tcPr>
           <w:p>
-            <w:pPr>
-              <w:cnfStyle w:val="000000000000" w:firstRow="0" w:lastRow="0" w:firstColumn="0" w:lastColumn="0" w:oddVBand="0" w:evenVBand="0" w:oddHBand="0" w:evenHBand="0" w:firstRowFirstColumn="0" w:firstRowLastColumn="0" w:lastRowFirstColumn="0" w:lastRowLastColumn="0"/>
-            </w:pPr>
             <w:r>
+              <w:rPr>
+                <w:sz w:val="18"/>
+              </w:rPr>
               <w:t>`OperatingName`</w:t>
             </w:r>
           </w:p>
@@ -502,26 +1006,25 @@
             <w:tcW w:w="3360" w:type="dxa"/>
           </w:tcPr>
           <w:p>
-            <w:pPr>
-              <w:cnfStyle w:val="000000000000" w:firstRow="0" w:lastRow="0" w:firstColumn="0" w:lastColumn="0" w:oddVBand="0" w:evenVBand="0" w:oddHBand="0" w:evenHBand="0" w:firstRowFirstColumn="0" w:firstRowLastColumn="0" w:lastRowFirstColumn="0" w:lastRowLastColumn="0"/>
-            </w:pPr>
             <w:r>
+              <w:rPr>
+                <w:sz w:val="18"/>
+              </w:rPr>
               <w:t>The operating or trading name used by the entity.</w:t>
             </w:r>
           </w:p>
         </w:tc>
       </w:tr>
       <w:tr>
-        <w:trPr>
-          <w:cnfStyle w:val="000000100000" w:firstRow="0" w:lastRow="0" w:firstColumn="0" w:lastColumn="0" w:oddVBand="0" w:evenVBand="0" w:oddHBand="1" w:evenHBand="0" w:firstRowFirstColumn="0" w:firstRowLastColumn="0" w:lastRowFirstColumn="0" w:lastRowLastColumn="0"/>
-        </w:trPr>
         <w:tc>
           <w:tcPr>
-            <w:cnfStyle w:val="001000000000" w:firstRow="0" w:lastRow="0" w:firstColumn="1" w:lastColumn="0" w:oddVBand="0" w:evenVBand="0" w:oddHBand="0" w:evenHBand="0" w:firstRowFirstColumn="0" w:firstRowLastColumn="0" w:lastRowFirstColumn="0" w:lastRowLastColumn="0"/>
             <w:tcW w:w="3360" w:type="dxa"/>
           </w:tcPr>
           <w:p>
             <w:r>
+              <w:rPr>
+                <w:sz w:val="18"/>
+              </w:rPr>
               <w:t>Job Number (`jobnumber`)</w:t>
             </w:r>
           </w:p>
@@ -531,10 +1034,10 @@
             <w:tcW w:w="3360" w:type="dxa"/>
           </w:tcPr>
           <w:p>
-            <w:pPr>
-              <w:cnfStyle w:val="000000100000" w:firstRow="0" w:lastRow="0" w:firstColumn="0" w:lastColumn="0" w:oddVBand="0" w:evenVBand="0" w:oddHBand="1" w:evenHBand="0" w:firstRowFirstColumn="0" w:firstRowLastColumn="0" w:lastRowFirstColumn="0" w:lastRowLastColumn="0"/>
-            </w:pPr>
             <w:r>
+              <w:rPr>
+                <w:sz w:val="18"/>
+              </w:rPr>
               <w:t>`EntityNo` as `VSKY-{jobnumber}`</w:t>
             </w:r>
           </w:p>
@@ -544,10 +1047,10 @@
             <w:tcW w:w="3360" w:type="dxa"/>
           </w:tcPr>
           <w:p>
-            <w:pPr>
-              <w:cnfStyle w:val="000000100000" w:firstRow="0" w:lastRow="0" w:firstColumn="0" w:lastColumn="0" w:oddVBand="0" w:evenVBand="0" w:oddHBand="1" w:evenHBand="0" w:firstRowFirstColumn="0" w:firstRowLastColumn="0" w:lastRowFirstColumn="0" w:lastRowLastColumn="0"/>
-            </w:pPr>
             <w:r>
+              <w:rPr>
+                <w:sz w:val="18"/>
+              </w:rPr>
               <w:t>The unique reference used to find the same entity later.</w:t>
             </w:r>
           </w:p>
@@ -556,11 +1059,13 @@
       <w:tr>
         <w:tc>
           <w:tcPr>
-            <w:cnfStyle w:val="001000000000" w:firstRow="0" w:lastRow="0" w:firstColumn="1" w:lastColumn="0" w:oddVBand="0" w:evenVBand="0" w:oddHBand="0" w:evenHBand="0" w:firstRowFirstColumn="0" w:firstRowLastColumn="0" w:lastRowFirstColumn="0" w:lastRowLastColumn="0"/>
             <w:tcW w:w="3360" w:type="dxa"/>
           </w:tcPr>
           <w:p>
             <w:r>
+              <w:rPr>
+                <w:sz w:val="18"/>
+              </w:rPr>
               <w:t>—</w:t>
             </w:r>
           </w:p>
@@ -570,10 +1075,10 @@
             <w:tcW w:w="3360" w:type="dxa"/>
           </w:tcPr>
           <w:p>
-            <w:pPr>
-              <w:cnfStyle w:val="000000000000" w:firstRow="0" w:lastRow="0" w:firstColumn="0" w:lastColumn="0" w:oddVBand="0" w:evenVBand="0" w:oddHBand="0" w:evenHBand="0" w:firstRowFirstColumn="0" w:firstRowLastColumn="0" w:lastRowFirstColumn="0" w:lastRowLastColumn="0"/>
-            </w:pPr>
             <w:r>
+              <w:rPr>
+                <w:sz w:val="18"/>
+              </w:rPr>
               <w:t>`OwnerType = Client`</w:t>
             </w:r>
           </w:p>
@@ -583,26 +1088,25 @@
             <w:tcW w:w="3360" w:type="dxa"/>
           </w:tcPr>
           <w:p>
-            <w:pPr>
-              <w:cnfStyle w:val="000000000000" w:firstRow="0" w:lastRow="0" w:firstColumn="0" w:lastColumn="0" w:oddVBand="0" w:evenVBand="0" w:oddHBand="0" w:evenHBand="0" w:firstRowFirstColumn="0" w:firstRowLastColumn="0" w:lastRowFirstColumn="0" w:lastRowLastColumn="0"/>
-            </w:pPr>
             <w:r>
+              <w:rPr>
+                <w:sz w:val="18"/>
+              </w:rPr>
               <w:t>Identifies the CaseWare entity as a client.</w:t>
             </w:r>
           </w:p>
         </w:tc>
       </w:tr>
       <w:tr>
-        <w:trPr>
-          <w:cnfStyle w:val="000000100000" w:firstRow="0" w:lastRow="0" w:firstColumn="0" w:lastColumn="0" w:oddVBand="0" w:evenVBand="0" w:oddHBand="1" w:evenHBand="0" w:firstRowFirstColumn="0" w:firstRowLastColumn="0" w:lastRowFirstColumn="0" w:lastRowLastColumn="0"/>
-        </w:trPr>
         <w:tc>
           <w:tcPr>
-            <w:cnfStyle w:val="001000000000" w:firstRow="0" w:lastRow="0" w:firstColumn="1" w:lastColumn="0" w:oddVBand="0" w:evenVBand="0" w:oddHBand="0" w:evenHBand="0" w:firstRowFirstColumn="0" w:firstRowLastColumn="0" w:lastRowFirstColumn="0" w:lastRowLastColumn="0"/>
             <w:tcW w:w="3360" w:type="dxa"/>
           </w:tcPr>
           <w:p>
             <w:r>
+              <w:rPr>
+                <w:sz w:val="18"/>
+              </w:rPr>
               <w:t>—</w:t>
             </w:r>
           </w:p>
@@ -612,10 +1116,10 @@
             <w:tcW w:w="3360" w:type="dxa"/>
           </w:tcPr>
           <w:p>
-            <w:pPr>
-              <w:cnfStyle w:val="000000100000" w:firstRow="0" w:lastRow="0" w:firstColumn="0" w:lastColumn="0" w:oddVBand="0" w:evenVBand="0" w:oddHBand="1" w:evenHBand="0" w:firstRowFirstColumn="0" w:firstRowLastColumn="0" w:lastRowFirstColumn="0" w:lastRowLastColumn="0"/>
-            </w:pPr>
             <w:r>
+              <w:rPr>
+                <w:sz w:val="18"/>
+              </w:rPr>
               <w:t>`Type = A`</w:t>
             </w:r>
           </w:p>
@@ -625,10 +1129,10 @@
             <w:tcW w:w="3360" w:type="dxa"/>
           </w:tcPr>
           <w:p>
-            <w:pPr>
-              <w:cnfStyle w:val="000000100000" w:firstRow="0" w:lastRow="0" w:firstColumn="0" w:lastColumn="0" w:oddVBand="0" w:evenVBand="0" w:oddHBand="1" w:evenHBand="0" w:firstRowFirstColumn="0" w:firstRowLastColumn="0" w:lastRowFirstColumn="0" w:lastRowLastColumn="0"/>
-            </w:pPr>
             <w:r>
+              <w:rPr>
+                <w:sz w:val="18"/>
+              </w:rPr>
               <w:t>Sets the CaseWare entity type required by the integration.</w:t>
             </w:r>
           </w:p>
@@ -637,11 +1141,13 @@
       <w:tr>
         <w:tc>
           <w:tcPr>
-            <w:cnfStyle w:val="001000000000" w:firstRow="0" w:lastRow="0" w:firstColumn="1" w:lastColumn="0" w:oddVBand="0" w:evenVBand="0" w:oddHBand="0" w:evenHBand="0" w:firstRowFirstColumn="0" w:firstRowLastColumn="0" w:lastRowFirstColumn="0" w:lastRowLastColumn="0"/>
             <w:tcW w:w="3360" w:type="dxa"/>
           </w:tcPr>
           <w:p>
             <w:r>
+              <w:rPr>
+                <w:sz w:val="18"/>
+              </w:rPr>
               <w:t>—</w:t>
             </w:r>
           </w:p>
@@ -651,10 +1157,10 @@
             <w:tcW w:w="3360" w:type="dxa"/>
           </w:tcPr>
           <w:p>
-            <w:pPr>
-              <w:cnfStyle w:val="000000000000" w:firstRow="0" w:lastRow="0" w:firstColumn="0" w:lastColumn="0" w:oddVBand="0" w:evenVBand="0" w:oddHBand="0" w:evenHBand="0" w:firstRowFirstColumn="0" w:firstRowLastColumn="0" w:lastRowFirstColumn="0" w:lastRowLastColumn="0"/>
-            </w:pPr>
             <w:r>
+              <w:rPr>
+                <w:sz w:val="18"/>
+              </w:rPr>
               <w:t>`OrganizationType = Corporation`</w:t>
             </w:r>
           </w:p>
@@ -664,26 +1170,25 @@
             <w:tcW w:w="3360" w:type="dxa"/>
           </w:tcPr>
           <w:p>
-            <w:pPr>
-              <w:cnfStyle w:val="000000000000" w:firstRow="0" w:lastRow="0" w:firstColumn="0" w:lastColumn="0" w:oddVBand="0" w:evenVBand="0" w:oddHBand="0" w:evenHBand="0" w:firstRowFirstColumn="0" w:firstRowLastColumn="0" w:lastRowFirstColumn="0" w:lastRowLastColumn="0"/>
-            </w:pPr>
             <w:r>
+              <w:rPr>
+                <w:sz w:val="18"/>
+              </w:rPr>
               <w:t>Sets the standard organization classification during creation.</w:t>
             </w:r>
           </w:p>
         </w:tc>
       </w:tr>
       <w:tr>
-        <w:trPr>
-          <w:cnfStyle w:val="000000100000" w:firstRow="0" w:lastRow="0" w:firstColumn="0" w:lastColumn="0" w:oddVBand="0" w:evenVBand="0" w:oddHBand="1" w:evenHBand="0" w:firstRowFirstColumn="0" w:firstRowLastColumn="0" w:lastRowFirstColumn="0" w:lastRowLastColumn="0"/>
-        </w:trPr>
         <w:tc>
           <w:tcPr>
-            <w:cnfStyle w:val="001000000000" w:firstRow="0" w:lastRow="0" w:firstColumn="1" w:lastColumn="0" w:oddVBand="0" w:evenVBand="0" w:oddHBand="0" w:evenHBand="0" w:firstRowFirstColumn="0" w:firstRowLastColumn="0" w:lastRowFirstColumn="0" w:lastRowLastColumn="0"/>
             <w:tcW w:w="3360" w:type="dxa"/>
           </w:tcPr>
           <w:p>
             <w:r>
+              <w:rPr>
+                <w:sz w:val="18"/>
+              </w:rPr>
               <w:t>—</w:t>
             </w:r>
           </w:p>
@@ -693,10 +1198,10 @@
             <w:tcW w:w="3360" w:type="dxa"/>
           </w:tcPr>
           <w:p>
-            <w:pPr>
-              <w:cnfStyle w:val="000000100000" w:firstRow="0" w:lastRow="0" w:firstColumn="0" w:lastColumn="0" w:oddVBand="0" w:evenVBand="0" w:oddHBand="1" w:evenHBand="0" w:firstRowFirstColumn="0" w:firstRowLastColumn="0" w:lastRowFirstColumn="0" w:lastRowLastColumn="0"/>
-            </w:pPr>
             <w:r>
+              <w:rPr>
+                <w:sz w:val="18"/>
+              </w:rPr>
               <w:t>`CountryCode = US`</w:t>
             </w:r>
           </w:p>
@@ -706,10 +1211,10 @@
             <w:tcW w:w="3360" w:type="dxa"/>
           </w:tcPr>
           <w:p>
-            <w:pPr>
-              <w:cnfStyle w:val="000000100000" w:firstRow="0" w:lastRow="0" w:firstColumn="0" w:lastColumn="0" w:oddVBand="0" w:evenVBand="0" w:oddHBand="1" w:evenHBand="0" w:firstRowFirstColumn="0" w:firstRowLastColumn="0" w:lastRowFirstColumn="0" w:lastRowLastColumn="0"/>
-            </w:pPr>
             <w:r>
+              <w:rPr>
+                <w:sz w:val="18"/>
+              </w:rPr>
               <w:t>Sets the standard country code during entity creation.</w:t>
             </w:r>
           </w:p>
@@ -724,10 +1229,14 @@
     </w:p>
     <w:p>
       <w:pPr>
-        <w:pStyle w:val="Heading3"/>
+        <w:pStyle w:val="Heading2"/>
       </w:pPr>
       <w:r>
-        <w:t>CaseWare entity address</w:t>
+        <w:lastRenderedPageBreak/>
+        <w:t xml:space="preserve">CaseWare </w:t>
+      </w:r>
+      <w:r>
+        <w:t>Entity Address</w:t>
       </w:r>
     </w:p>
     <w:p>
@@ -737,7 +1246,7 @@
     </w:p>
     <w:tbl>
       <w:tblPr>
-        <w:tblStyle w:val="LightShading-Accent1"/>
+        <w:tblStyle w:val="TableGrid"/>
         <w:tblW w:w="0" w:type="auto"/>
         <w:tblLook w:val="04A0" w:firstRow="1" w:lastRow="0" w:firstColumn="1" w:lastColumn="0" w:noHBand="0" w:noVBand="1"/>
       </w:tblPr>
@@ -747,17 +1256,17 @@
         <w:gridCol w:w="3360"/>
       </w:tblGrid>
       <w:tr>
-        <w:trPr>
-          <w:cnfStyle w:val="100000000000" w:firstRow="1" w:lastRow="0" w:firstColumn="0" w:lastColumn="0" w:oddVBand="0" w:evenVBand="0" w:oddHBand="0" w:evenHBand="0" w:firstRowFirstColumn="0" w:firstRowLastColumn="0" w:lastRowFirstColumn="0" w:lastRowLastColumn="0"/>
-        </w:trPr>
         <w:tc>
           <w:tcPr>
-            <w:cnfStyle w:val="001000000000" w:firstRow="0" w:lastRow="0" w:firstColumn="1" w:lastColumn="0" w:oddVBand="0" w:evenVBand="0" w:oddHBand="0" w:evenHBand="0" w:firstRowFirstColumn="0" w:firstRowLastColumn="0" w:lastRowFirstColumn="0" w:lastRowLastColumn="0"/>
             <w:tcW w:w="3360" w:type="dxa"/>
+            <w:shd w:val="clear" w:color="auto" w:fill="D9EAF7"/>
           </w:tcPr>
           <w:p>
             <w:r>
-              <w:lastRenderedPageBreak/>
+              <w:rPr>
+                <w:b/>
+                <w:sz w:val="18"/>
+              </w:rPr>
               <w:t>Maconomy information</w:t>
             </w:r>
           </w:p>
@@ -765,12 +1274,14 @@
         <w:tc>
           <w:tcPr>
             <w:tcW w:w="3360" w:type="dxa"/>
+            <w:shd w:val="clear" w:color="auto" w:fill="D9EAF7"/>
           </w:tcPr>
           <w:p>
-            <w:pPr>
-              <w:cnfStyle w:val="100000000000" w:firstRow="1" w:lastRow="0" w:firstColumn="0" w:lastColumn="0" w:oddVBand="0" w:evenVBand="0" w:oddHBand="0" w:evenHBand="0" w:firstRowFirstColumn="0" w:firstRowLastColumn="0" w:lastRowFirstColumn="0" w:lastRowLastColumn="0"/>
-            </w:pPr>
             <w:r>
+              <w:rPr>
+                <w:b/>
+                <w:sz w:val="18"/>
+              </w:rPr>
               <w:t>CaseWare address field</w:t>
             </w:r>
           </w:p>
@@ -778,28 +1289,29 @@
         <w:tc>
           <w:tcPr>
             <w:tcW w:w="3360" w:type="dxa"/>
+            <w:shd w:val="clear" w:color="auto" w:fill="D9EAF7"/>
           </w:tcPr>
           <w:p>
-            <w:pPr>
-              <w:cnfStyle w:val="100000000000" w:firstRow="1" w:lastRow="0" w:firstColumn="0" w:lastColumn="0" w:oddVBand="0" w:evenVBand="0" w:oddHBand="0" w:evenHBand="0" w:firstRowFirstColumn="0" w:firstRowLastColumn="0" w:lastRowFirstColumn="0" w:lastRowLastColumn="0"/>
-            </w:pPr>
             <w:r>
+              <w:rPr>
+                <w:b/>
+                <w:sz w:val="18"/>
+              </w:rPr>
               <w:t>Functional meaning</w:t>
             </w:r>
           </w:p>
         </w:tc>
       </w:tr>
       <w:tr>
-        <w:trPr>
-          <w:cnfStyle w:val="000000100000" w:firstRow="0" w:lastRow="0" w:firstColumn="0" w:lastColumn="0" w:oddVBand="0" w:evenVBand="0" w:oddHBand="1" w:evenHBand="0" w:firstRowFirstColumn="0" w:firstRowLastColumn="0" w:lastRowFirstColumn="0" w:lastRowLastColumn="0"/>
-        </w:trPr>
         <w:tc>
           <w:tcPr>
-            <w:cnfStyle w:val="001000000000" w:firstRow="0" w:lastRow="0" w:firstColumn="1" w:lastColumn="0" w:oddVBand="0" w:evenVBand="0" w:oddHBand="0" w:evenHBand="0" w:firstRowFirstColumn="0" w:firstRowLastColumn="0" w:lastRowFirstColumn="0" w:lastRowLastColumn="0"/>
             <w:tcW w:w="3360" w:type="dxa"/>
           </w:tcPr>
           <w:p>
             <w:r>
+              <w:rPr>
+                <w:sz w:val="18"/>
+              </w:rPr>
               <w:t>Customer name (`name1`)</w:t>
             </w:r>
           </w:p>
@@ -809,10 +1321,10 @@
             <w:tcW w:w="3360" w:type="dxa"/>
           </w:tcPr>
           <w:p>
-            <w:pPr>
-              <w:cnfStyle w:val="000000100000" w:firstRow="0" w:lastRow="0" w:firstColumn="0" w:lastColumn="0" w:oddVBand="0" w:evenVBand="0" w:oddHBand="1" w:evenHBand="0" w:firstRowFirstColumn="0" w:firstRowLastColumn="0" w:lastRowFirstColumn="0" w:lastRowLastColumn="0"/>
-            </w:pPr>
             <w:r>
+              <w:rPr>
+                <w:sz w:val="18"/>
+              </w:rPr>
               <w:t>`Name`</w:t>
             </w:r>
           </w:p>
@@ -822,10 +1334,10 @@
             <w:tcW w:w="3360" w:type="dxa"/>
           </w:tcPr>
           <w:p>
-            <w:pPr>
-              <w:cnfStyle w:val="000000100000" w:firstRow="0" w:lastRow="0" w:firstColumn="0" w:lastColumn="0" w:oddVBand="0" w:evenVBand="0" w:oddHBand="1" w:evenHBand="0" w:firstRowFirstColumn="0" w:firstRowLastColumn="0" w:lastRowFirstColumn="0" w:lastRowLastColumn="0"/>
-            </w:pPr>
             <w:r>
+              <w:rPr>
+                <w:sz w:val="18"/>
+              </w:rPr>
               <w:t>The name shown for the address or customer location.</w:t>
             </w:r>
           </w:p>
@@ -834,11 +1346,13 @@
       <w:tr>
         <w:tc>
           <w:tcPr>
-            <w:cnfStyle w:val="001000000000" w:firstRow="0" w:lastRow="0" w:firstColumn="1" w:lastColumn="0" w:oddVBand="0" w:evenVBand="0" w:oddHBand="0" w:evenHBand="0" w:firstRowFirstColumn="0" w:firstRowLastColumn="0" w:lastRowFirstColumn="0" w:lastRowLastColumn="0"/>
             <w:tcW w:w="3360" w:type="dxa"/>
           </w:tcPr>
           <w:p>
             <w:r>
+              <w:rPr>
+                <w:sz w:val="18"/>
+              </w:rPr>
               <w:t>Address line 1 (`name2`)</w:t>
             </w:r>
           </w:p>
@@ -848,10 +1362,10 @@
             <w:tcW w:w="3360" w:type="dxa"/>
           </w:tcPr>
           <w:p>
-            <w:pPr>
-              <w:cnfStyle w:val="000000000000" w:firstRow="0" w:lastRow="0" w:firstColumn="0" w:lastColumn="0" w:oddVBand="0" w:evenVBand="0" w:oddHBand="0" w:evenHBand="0" w:firstRowFirstColumn="0" w:firstRowLastColumn="0" w:lastRowFirstColumn="0" w:lastRowLastColumn="0"/>
-            </w:pPr>
             <w:r>
+              <w:rPr>
+                <w:sz w:val="18"/>
+              </w:rPr>
               <w:t>`Address1`</w:t>
             </w:r>
           </w:p>
@@ -861,26 +1375,25 @@
             <w:tcW w:w="3360" w:type="dxa"/>
           </w:tcPr>
           <w:p>
-            <w:pPr>
-              <w:cnfStyle w:val="000000000000" w:firstRow="0" w:lastRow="0" w:firstColumn="0" w:lastColumn="0" w:oddVBand="0" w:evenVBand="0" w:oddHBand="0" w:evenHBand="0" w:firstRowFirstColumn="0" w:firstRowLastColumn="0" w:lastRowFirstColumn="0" w:lastRowLastColumn="0"/>
-            </w:pPr>
             <w:r>
+              <w:rPr>
+                <w:sz w:val="18"/>
+              </w:rPr>
               <w:t>The first street or address line.</w:t>
             </w:r>
           </w:p>
         </w:tc>
       </w:tr>
       <w:tr>
-        <w:trPr>
-          <w:cnfStyle w:val="000000100000" w:firstRow="0" w:lastRow="0" w:firstColumn="0" w:lastColumn="0" w:oddVBand="0" w:evenVBand="0" w:oddHBand="1" w:evenHBand="0" w:firstRowFirstColumn="0" w:firstRowLastColumn="0" w:lastRowFirstColumn="0" w:lastRowLastColumn="0"/>
-        </w:trPr>
         <w:tc>
           <w:tcPr>
-            <w:cnfStyle w:val="001000000000" w:firstRow="0" w:lastRow="0" w:firstColumn="1" w:lastColumn="0" w:oddVBand="0" w:evenVBand="0" w:oddHBand="0" w:evenHBand="0" w:firstRowFirstColumn="0" w:firstRowLastColumn="0" w:lastRowFirstColumn="0" w:lastRowLastColumn="0"/>
             <w:tcW w:w="3360" w:type="dxa"/>
           </w:tcPr>
           <w:p>
             <w:r>
+              <w:rPr>
+                <w:sz w:val="18"/>
+              </w:rPr>
               <w:t>Address line 2 (`name3`)</w:t>
             </w:r>
           </w:p>
@@ -890,10 +1403,10 @@
             <w:tcW w:w="3360" w:type="dxa"/>
           </w:tcPr>
           <w:p>
-            <w:pPr>
-              <w:cnfStyle w:val="000000100000" w:firstRow="0" w:lastRow="0" w:firstColumn="0" w:lastColumn="0" w:oddVBand="0" w:evenVBand="0" w:oddHBand="1" w:evenHBand="0" w:firstRowFirstColumn="0" w:firstRowLastColumn="0" w:lastRowFirstColumn="0" w:lastRowLastColumn="0"/>
-            </w:pPr>
             <w:r>
+              <w:rPr>
+                <w:sz w:val="18"/>
+              </w:rPr>
               <w:t>`Address2`</w:t>
             </w:r>
           </w:p>
@@ -903,10 +1416,10 @@
             <w:tcW w:w="3360" w:type="dxa"/>
           </w:tcPr>
           <w:p>
-            <w:pPr>
-              <w:cnfStyle w:val="000000100000" w:firstRow="0" w:lastRow="0" w:firstColumn="0" w:lastColumn="0" w:oddVBand="0" w:evenVBand="0" w:oddHBand="1" w:evenHBand="0" w:firstRowFirstColumn="0" w:firstRowLastColumn="0" w:lastRowFirstColumn="0" w:lastRowLastColumn="0"/>
-            </w:pPr>
             <w:r>
+              <w:rPr>
+                <w:sz w:val="18"/>
+              </w:rPr>
               <w:t>The second address line, when provided.</w:t>
             </w:r>
           </w:p>
@@ -915,11 +1428,13 @@
       <w:tr>
         <w:tc>
           <w:tcPr>
-            <w:cnfStyle w:val="001000000000" w:firstRow="0" w:lastRow="0" w:firstColumn="1" w:lastColumn="0" w:oddVBand="0" w:evenVBand="0" w:oddHBand="0" w:evenHBand="0" w:firstRowFirstColumn="0" w:firstRowLastColumn="0" w:lastRowFirstColumn="0" w:lastRowLastColumn="0"/>
             <w:tcW w:w="3360" w:type="dxa"/>
           </w:tcPr>
           <w:p>
             <w:r>
+              <w:rPr>
+                <w:sz w:val="18"/>
+              </w:rPr>
               <w:t>Address line 3 (`name4`)</w:t>
             </w:r>
           </w:p>
@@ -929,10 +1444,10 @@
             <w:tcW w:w="3360" w:type="dxa"/>
           </w:tcPr>
           <w:p>
-            <w:pPr>
-              <w:cnfStyle w:val="000000000000" w:firstRow="0" w:lastRow="0" w:firstColumn="0" w:lastColumn="0" w:oddVBand="0" w:evenVBand="0" w:oddHBand="0" w:evenHBand="0" w:firstRowFirstColumn="0" w:firstRowLastColumn="0" w:lastRowFirstColumn="0" w:lastRowLastColumn="0"/>
-            </w:pPr>
             <w:r>
+              <w:rPr>
+                <w:sz w:val="18"/>
+              </w:rPr>
               <w:t>`Address3`</w:t>
             </w:r>
           </w:p>
@@ -942,26 +1457,25 @@
             <w:tcW w:w="3360" w:type="dxa"/>
           </w:tcPr>
           <w:p>
-            <w:pPr>
-              <w:cnfStyle w:val="000000000000" w:firstRow="0" w:lastRow="0" w:firstColumn="0" w:lastColumn="0" w:oddVBand="0" w:evenVBand="0" w:oddHBand="0" w:evenHBand="0" w:firstRowFirstColumn="0" w:firstRowLastColumn="0" w:lastRowFirstColumn="0" w:lastRowLastColumn="0"/>
-            </w:pPr>
             <w:r>
+              <w:rPr>
+                <w:sz w:val="18"/>
+              </w:rPr>
               <w:t>The third address line, when provided.</w:t>
             </w:r>
           </w:p>
         </w:tc>
       </w:tr>
       <w:tr>
-        <w:trPr>
-          <w:cnfStyle w:val="000000100000" w:firstRow="0" w:lastRow="0" w:firstColumn="0" w:lastColumn="0" w:oddVBand="0" w:evenVBand="0" w:oddHBand="1" w:evenHBand="0" w:firstRowFirstColumn="0" w:firstRowLastColumn="0" w:lastRowFirstColumn="0" w:lastRowLastColumn="0"/>
-        </w:trPr>
         <w:tc>
           <w:tcPr>
-            <w:cnfStyle w:val="001000000000" w:firstRow="0" w:lastRow="0" w:firstColumn="1" w:lastColumn="0" w:oddVBand="0" w:evenVBand="0" w:oddHBand="0" w:evenHBand="0" w:firstRowFirstColumn="0" w:firstRowLastColumn="0" w:lastRowFirstColumn="0" w:lastRowLastColumn="0"/>
             <w:tcW w:w="3360" w:type="dxa"/>
           </w:tcPr>
           <w:p>
             <w:r>
+              <w:rPr>
+                <w:sz w:val="18"/>
+              </w:rPr>
               <w:t>City or postal district (`postaldistrict`)</w:t>
             </w:r>
           </w:p>
@@ -971,10 +1485,10 @@
             <w:tcW w:w="3360" w:type="dxa"/>
           </w:tcPr>
           <w:p>
-            <w:pPr>
-              <w:cnfStyle w:val="000000100000" w:firstRow="0" w:lastRow="0" w:firstColumn="0" w:lastColumn="0" w:oddVBand="0" w:evenVBand="0" w:oddHBand="1" w:evenHBand="0" w:firstRowFirstColumn="0" w:firstRowLastColumn="0" w:lastRowFirstColumn="0" w:lastRowLastColumn="0"/>
-            </w:pPr>
             <w:r>
+              <w:rPr>
+                <w:sz w:val="18"/>
+              </w:rPr>
               <w:t>`City`</w:t>
             </w:r>
           </w:p>
@@ -984,10 +1498,10 @@
             <w:tcW w:w="3360" w:type="dxa"/>
           </w:tcPr>
           <w:p>
-            <w:pPr>
-              <w:cnfStyle w:val="000000100000" w:firstRow="0" w:lastRow="0" w:firstColumn="0" w:lastColumn="0" w:oddVBand="0" w:evenVBand="0" w:oddHBand="1" w:evenHBand="0" w:firstRowFirstColumn="0" w:firstRowLastColumn="0" w:lastRowFirstColumn="0" w:lastRowLastColumn="0"/>
-            </w:pPr>
             <w:r>
+              <w:rPr>
+                <w:sz w:val="18"/>
+              </w:rPr>
               <w:t>The city or locality.</w:t>
             </w:r>
           </w:p>
@@ -996,11 +1510,13 @@
       <w:tr>
         <w:tc>
           <w:tcPr>
-            <w:cnfStyle w:val="001000000000" w:firstRow="0" w:lastRow="0" w:firstColumn="1" w:lastColumn="0" w:oddVBand="0" w:evenVBand="0" w:oddHBand="0" w:evenHBand="0" w:firstRowFirstColumn="0" w:firstRowLastColumn="0" w:lastRowFirstColumn="0" w:lastRowLastColumn="0"/>
             <w:tcW w:w="3360" w:type="dxa"/>
           </w:tcPr>
           <w:p>
             <w:r>
+              <w:rPr>
+                <w:sz w:val="18"/>
+              </w:rPr>
               <w:t>Country (`country`)</w:t>
             </w:r>
           </w:p>
@@ -1010,10 +1526,10 @@
             <w:tcW w:w="3360" w:type="dxa"/>
           </w:tcPr>
           <w:p>
-            <w:pPr>
-              <w:cnfStyle w:val="000000000000" w:firstRow="0" w:lastRow="0" w:firstColumn="0" w:lastColumn="0" w:oddVBand="0" w:evenVBand="0" w:oddHBand="0" w:evenHBand="0" w:firstRowFirstColumn="0" w:firstRowLastColumn="0" w:lastRowFirstColumn="0" w:lastRowLastColumn="0"/>
-            </w:pPr>
             <w:r>
+              <w:rPr>
+                <w:sz w:val="18"/>
+              </w:rPr>
               <w:t>`Country`</w:t>
             </w:r>
           </w:p>
@@ -1023,26 +1539,25 @@
             <w:tcW w:w="3360" w:type="dxa"/>
           </w:tcPr>
           <w:p>
-            <w:pPr>
-              <w:cnfStyle w:val="000000000000" w:firstRow="0" w:lastRow="0" w:firstColumn="0" w:lastColumn="0" w:oddVBand="0" w:evenVBand="0" w:oddHBand="0" w:evenHBand="0" w:firstRowFirstColumn="0" w:firstRowLastColumn="0" w:lastRowFirstColumn="0" w:lastRowLastColumn="0"/>
-            </w:pPr>
             <w:r>
+              <w:rPr>
+                <w:sz w:val="18"/>
+              </w:rPr>
               <w:t>The country value from Maconomy.</w:t>
             </w:r>
           </w:p>
         </w:tc>
       </w:tr>
       <w:tr>
-        <w:trPr>
-          <w:cnfStyle w:val="000000100000" w:firstRow="0" w:lastRow="0" w:firstColumn="0" w:lastColumn="0" w:oddVBand="0" w:evenVBand="0" w:oddHBand="1" w:evenHBand="0" w:firstRowFirstColumn="0" w:firstRowLastColumn="0" w:lastRowFirstColumn="0" w:lastRowLastColumn="0"/>
-        </w:trPr>
         <w:tc>
           <w:tcPr>
-            <w:cnfStyle w:val="001000000000" w:firstRow="0" w:lastRow="0" w:firstColumn="1" w:lastColumn="0" w:oddVBand="0" w:evenVBand="0" w:oddHBand="0" w:evenHBand="0" w:firstRowFirstColumn="0" w:firstRowLastColumn="0" w:lastRowFirstColumn="0" w:lastRowLastColumn="0"/>
             <w:tcW w:w="3360" w:type="dxa"/>
           </w:tcPr>
           <w:p>
             <w:r>
+              <w:rPr>
+                <w:sz w:val="18"/>
+              </w:rPr>
               <w:t>—</w:t>
             </w:r>
           </w:p>
@@ -1052,10 +1567,10 @@
             <w:tcW w:w="3360" w:type="dxa"/>
           </w:tcPr>
           <w:p>
-            <w:pPr>
-              <w:cnfStyle w:val="000000100000" w:firstRow="0" w:lastRow="0" w:firstColumn="0" w:lastColumn="0" w:oddVBand="0" w:evenVBand="0" w:oddHBand="1" w:evenHBand="0" w:firstRowFirstColumn="0" w:firstRowLastColumn="0" w:lastRowFirstColumn="0" w:lastRowLastColumn="0"/>
-            </w:pPr>
             <w:r>
+              <w:rPr>
+                <w:sz w:val="18"/>
+              </w:rPr>
               <w:t>`AddressCategory = Business`</w:t>
             </w:r>
           </w:p>
@@ -1065,10 +1580,10 @@
             <w:tcW w:w="3360" w:type="dxa"/>
           </w:tcPr>
           <w:p>
-            <w:pPr>
-              <w:cnfStyle w:val="000000100000" w:firstRow="0" w:lastRow="0" w:firstColumn="0" w:lastColumn="0" w:oddVBand="0" w:evenVBand="0" w:oddHBand="1" w:evenHBand="0" w:firstRowFirstColumn="0" w:firstRowLastColumn="0" w:lastRowFirstColumn="0" w:lastRowLastColumn="0"/>
-            </w:pPr>
             <w:r>
+              <w:rPr>
+                <w:sz w:val="18"/>
+              </w:rPr>
               <w:t>Identifies the address as a business address.</w:t>
             </w:r>
           </w:p>
@@ -1083,7 +1598,7 @@
     </w:p>
     <w:p>
       <w:pPr>
-        <w:pStyle w:val="Heading3"/>
+        <w:pStyle w:val="Heading2"/>
       </w:pPr>
       <w:r>
         <w:t>Synchronization and control information</w:t>
@@ -1096,7 +1611,7 @@
     </w:p>
     <w:tbl>
       <w:tblPr>
-        <w:tblStyle w:val="LightShading-Accent1"/>
+        <w:tblStyle w:val="TableGrid"/>
         <w:tblW w:w="0" w:type="auto"/>
         <w:tblLook w:val="04A0" w:firstRow="1" w:lastRow="0" w:firstColumn="1" w:lastColumn="0" w:noHBand="0" w:noVBand="1"/>
       </w:tblPr>
@@ -1105,16 +1620,17 @@
         <w:gridCol w:w="5040"/>
       </w:tblGrid>
       <w:tr>
-        <w:trPr>
-          <w:cnfStyle w:val="100000000000" w:firstRow="1" w:lastRow="0" w:firstColumn="0" w:lastColumn="0" w:oddVBand="0" w:evenVBand="0" w:oddHBand="0" w:evenHBand="0" w:firstRowFirstColumn="0" w:firstRowLastColumn="0" w:lastRowFirstColumn="0" w:lastRowLastColumn="0"/>
-        </w:trPr>
         <w:tc>
           <w:tcPr>
-            <w:cnfStyle w:val="001000000000" w:firstRow="0" w:lastRow="0" w:firstColumn="1" w:lastColumn="0" w:oddVBand="0" w:evenVBand="0" w:oddHBand="0" w:evenHBand="0" w:firstRowFirstColumn="0" w:firstRowLastColumn="0" w:lastRowFirstColumn="0" w:lastRowLastColumn="0"/>
             <w:tcW w:w="5040" w:type="dxa"/>
+            <w:shd w:val="clear" w:color="auto" w:fill="D9EAF7"/>
           </w:tcPr>
           <w:p>
             <w:r>
+              <w:rPr>
+                <w:b/>
+                <w:sz w:val="18"/>
+              </w:rPr>
               <w:t>Maconomy information</w:t>
             </w:r>
           </w:p>
@@ -1122,28 +1638,29 @@
         <w:tc>
           <w:tcPr>
             <w:tcW w:w="5040" w:type="dxa"/>
+            <w:shd w:val="clear" w:color="auto" w:fill="D9EAF7"/>
           </w:tcPr>
           <w:p>
-            <w:pPr>
-              <w:cnfStyle w:val="100000000000" w:firstRow="1" w:lastRow="0" w:firstColumn="0" w:lastColumn="0" w:oddVBand="0" w:evenVBand="0" w:oddHBand="0" w:evenHBand="0" w:firstRowFirstColumn="0" w:firstRowLastColumn="0" w:lastRowFirstColumn="0" w:lastRowLastColumn="0"/>
-            </w:pPr>
             <w:r>
+              <w:rPr>
+                <w:b/>
+                <w:sz w:val="18"/>
+              </w:rPr>
               <w:t>How it is used</w:t>
             </w:r>
           </w:p>
         </w:tc>
       </w:tr>
       <w:tr>
-        <w:trPr>
-          <w:cnfStyle w:val="000000100000" w:firstRow="0" w:lastRow="0" w:firstColumn="0" w:lastColumn="0" w:oddVBand="0" w:evenVBand="0" w:oddHBand="1" w:evenHBand="0" w:firstRowFirstColumn="0" w:firstRowLastColumn="0" w:lastRowFirstColumn="0" w:lastRowLastColumn="0"/>
-        </w:trPr>
         <w:tc>
           <w:tcPr>
-            <w:cnfStyle w:val="001000000000" w:firstRow="0" w:lastRow="0" w:firstColumn="1" w:lastColumn="0" w:oddVBand="0" w:evenVBand="0" w:oddHBand="0" w:evenHBand="0" w:firstRowFirstColumn="0" w:firstRowLastColumn="0" w:lastRowFirstColumn="0" w:lastRowLastColumn="0"/>
             <w:tcW w:w="5040" w:type="dxa"/>
           </w:tcPr>
           <w:p>
             <w:r>
+              <w:rPr>
+                <w:sz w:val="18"/>
+              </w:rPr>
               <w:t>`template`</w:t>
             </w:r>
           </w:p>
@@ -1153,10 +1670,10 @@
             <w:tcW w:w="5040" w:type="dxa"/>
           </w:tcPr>
           <w:p>
-            <w:pPr>
-              <w:cnfStyle w:val="000000100000" w:firstRow="0" w:lastRow="0" w:firstColumn="0" w:lastColumn="0" w:oddVBand="0" w:evenVBand="0" w:oddHBand="1" w:evenHBand="0" w:firstRowFirstColumn="0" w:firstRowLastColumn="0" w:lastRowFirstColumn="0" w:lastRowLastColumn="0"/>
-            </w:pPr>
             <w:r>
+              <w:rPr>
+                <w:sz w:val="18"/>
+              </w:rPr>
               <w:t>Template jobs are excluded.</w:t>
             </w:r>
           </w:p>
@@ -1165,11 +1682,13 @@
       <w:tr>
         <w:tc>
           <w:tcPr>
-            <w:cnfStyle w:val="001000000000" w:firstRow="0" w:lastRow="0" w:firstColumn="1" w:lastColumn="0" w:oddVBand="0" w:evenVBand="0" w:oddHBand="0" w:evenHBand="0" w:firstRowFirstColumn="0" w:firstRowLastColumn="0" w:lastRowFirstColumn="0" w:lastRowLastColumn="0"/>
             <w:tcW w:w="5040" w:type="dxa"/>
           </w:tcPr>
           <w:p>
             <w:r>
+              <w:rPr>
+                <w:sz w:val="18"/>
+              </w:rPr>
               <w:t>`closed`</w:t>
             </w:r>
           </w:p>
@@ -1179,26 +1698,25 @@
             <w:tcW w:w="5040" w:type="dxa"/>
           </w:tcPr>
           <w:p>
-            <w:pPr>
-              <w:cnfStyle w:val="000000000000" w:firstRow="0" w:lastRow="0" w:firstColumn="0" w:lastColumn="0" w:oddVBand="0" w:evenVBand="0" w:oddHBand="0" w:evenHBand="0" w:firstRowFirstColumn="0" w:firstRowLastColumn="0" w:lastRowFirstColumn="0" w:lastRowLastColumn="0"/>
-            </w:pPr>
             <w:r>
+              <w:rPr>
+                <w:sz w:val="18"/>
+              </w:rPr>
               <w:t>Closed jobs are excluded.</w:t>
             </w:r>
           </w:p>
         </w:tc>
       </w:tr>
       <w:tr>
-        <w:trPr>
-          <w:cnfStyle w:val="000000100000" w:firstRow="0" w:lastRow="0" w:firstColumn="0" w:lastColumn="0" w:oddVBand="0" w:evenVBand="0" w:oddHBand="1" w:evenHBand="0" w:firstRowFirstColumn="0" w:firstRowLastColumn="0" w:lastRowFirstColumn="0" w:lastRowLastColumn="0"/>
-        </w:trPr>
         <w:tc>
           <w:tcPr>
-            <w:cnfStyle w:val="001000000000" w:firstRow="0" w:lastRow="0" w:firstColumn="1" w:lastColumn="0" w:oddVBand="0" w:evenVBand="0" w:oddHBand="0" w:evenHBand="0" w:firstRowFirstColumn="0" w:firstRowLastColumn="0" w:lastRowFirstColumn="0" w:lastRowLastColumn="0"/>
             <w:tcW w:w="5040" w:type="dxa"/>
           </w:tcPr>
           <w:p>
             <w:r>
+              <w:rPr>
+                <w:sz w:val="18"/>
+              </w:rPr>
               <w:t>`createddate`</w:t>
             </w:r>
           </w:p>
@@ -1208,10 +1726,10 @@
             <w:tcW w:w="5040" w:type="dxa"/>
           </w:tcPr>
           <w:p>
-            <w:pPr>
-              <w:cnfStyle w:val="000000100000" w:firstRow="0" w:lastRow="0" w:firstColumn="0" w:lastColumn="0" w:oddVBand="0" w:evenVBand="0" w:oddHBand="1" w:evenHBand="0" w:firstRowFirstColumn="0" w:firstRowLastColumn="0" w:lastRowFirstColumn="0" w:lastRowLastColumn="0"/>
-            </w:pPr>
             <w:r>
+              <w:rPr>
+                <w:sz w:val="18"/>
+              </w:rPr>
               <w:t>A newly created job is considered during the current two-day window.</w:t>
             </w:r>
           </w:p>
@@ -1220,11 +1738,13 @@
       <w:tr>
         <w:tc>
           <w:tcPr>
-            <w:cnfStyle w:val="001000000000" w:firstRow="0" w:lastRow="0" w:firstColumn="1" w:lastColumn="0" w:oddVBand="0" w:evenVBand="0" w:oddHBand="0" w:evenHBand="0" w:firstRowFirstColumn="0" w:firstRowLastColumn="0" w:lastRowFirstColumn="0" w:lastRowLastColumn="0"/>
             <w:tcW w:w="5040" w:type="dxa"/>
           </w:tcPr>
           <w:p>
             <w:r>
+              <w:rPr>
+                <w:sz w:val="18"/>
+              </w:rPr>
               <w:t>`changeddate`</w:t>
             </w:r>
           </w:p>
@@ -1234,26 +1754,25 @@
             <w:tcW w:w="5040" w:type="dxa"/>
           </w:tcPr>
           <w:p>
-            <w:pPr>
-              <w:cnfStyle w:val="000000000000" w:firstRow="0" w:lastRow="0" w:firstColumn="0" w:lastColumn="0" w:oddVBand="0" w:evenVBand="0" w:oddHBand="0" w:evenHBand="0" w:firstRowFirstColumn="0" w:firstRowLastColumn="0" w:lastRowFirstColumn="0" w:lastRowLastColumn="0"/>
-            </w:pPr>
             <w:r>
+              <w:rPr>
+                <w:sz w:val="18"/>
+              </w:rPr>
               <w:t>A changed job is considered during the current two-day window.</w:t>
             </w:r>
           </w:p>
         </w:tc>
       </w:tr>
       <w:tr>
-        <w:trPr>
-          <w:cnfStyle w:val="000000100000" w:firstRow="0" w:lastRow="0" w:firstColumn="0" w:lastColumn="0" w:oddVBand="0" w:evenVBand="0" w:oddHBand="1" w:evenHBand="0" w:firstRowFirstColumn="0" w:firstRowLastColumn="0" w:lastRowFirstColumn="0" w:lastRowLastColumn="0"/>
-        </w:trPr>
         <w:tc>
           <w:tcPr>
-            <w:cnfStyle w:val="001000000000" w:firstRow="0" w:lastRow="0" w:firstColumn="1" w:lastColumn="0" w:oddVBand="0" w:evenVBand="0" w:oddHBand="0" w:evenHBand="0" w:firstRowFirstColumn="0" w:firstRowLastColumn="0" w:lastRowFirstColumn="0" w:lastRowLastColumn="0"/>
             <w:tcW w:w="5040" w:type="dxa"/>
           </w:tcPr>
           <w:p>
             <w:r>
+              <w:rPr>
+                <w:sz w:val="18"/>
+              </w:rPr>
               <w:t>`versionnumber`</w:t>
             </w:r>
           </w:p>
@@ -1263,10 +1782,10 @@
             <w:tcW w:w="5040" w:type="dxa"/>
           </w:tcPr>
           <w:p>
-            <w:pPr>
-              <w:cnfStyle w:val="000000100000" w:firstRow="0" w:lastRow="0" w:firstColumn="0" w:lastColumn="0" w:oddVBand="0" w:evenVBand="0" w:oddHBand="1" w:evenHBand="0" w:firstRowFirstColumn="0" w:firstRowLastColumn="0" w:lastRowFirstColumn="0" w:lastRowLastColumn="0"/>
-            </w:pPr>
             <w:r>
+              <w:rPr>
+                <w:sz w:val="18"/>
+              </w:rPr>
               <w:t>Compared with `text19.syncedVersion` to identify newer Maconomy data.</w:t>
             </w:r>
           </w:p>
@@ -1275,11 +1794,13 @@
       <w:tr>
         <w:tc>
           <w:tcPr>
-            <w:cnfStyle w:val="001000000000" w:firstRow="0" w:lastRow="0" w:firstColumn="1" w:lastColumn="0" w:oddVBand="0" w:evenVBand="0" w:oddHBand="0" w:evenHBand="0" w:firstRowFirstColumn="0" w:firstRowLastColumn="0" w:lastRowFirstColumn="0" w:lastRowLastColumn="0"/>
             <w:tcW w:w="5040" w:type="dxa"/>
           </w:tcPr>
           <w:p>
             <w:r>
+              <w:rPr>
+                <w:sz w:val="18"/>
+              </w:rPr>
               <w:t>`text19`</w:t>
             </w:r>
           </w:p>
@@ -1289,10 +1810,10 @@
             <w:tcW w:w="5040" w:type="dxa"/>
           </w:tcPr>
           <w:p>
-            <w:pPr>
-              <w:cnfStyle w:val="000000000000" w:firstRow="0" w:lastRow="0" w:firstColumn="0" w:lastColumn="0" w:oddVBand="0" w:evenVBand="0" w:oddHBand="0" w:evenHBand="0" w:firstRowFirstColumn="0" w:firstRowLastColumn="0" w:lastRowFirstColumn="0" w:lastRowLastColumn="0"/>
-            </w:pPr>
             <w:r>
+              <w:rPr>
+                <w:sz w:val="18"/>
+              </w:rPr>
               <w:t>Stores the CaseWare entity/address mapping and synchronized version.</w:t>
             </w:r>
           </w:p>
@@ -1312,10 +1833,16 @@
     </w:p>
     <w:p>
       <w:pPr>
-        <w:pStyle w:val="Heading2"/>
+        <w:pStyle w:val="Heading1"/>
       </w:pPr>
       <w:r>
-        <w:t>How the integration decides what to do</w:t>
+        <w:t xml:space="preserve">How </w:t>
+      </w:r>
+      <w:r>
+        <w:t>integration</w:t>
+      </w:r>
+      <w:r>
+        <w:t xml:space="preserve"> decides what to do</w:t>
       </w:r>
     </w:p>
     <w:p>
@@ -1324,38 +1851,16 @@
       </w:r>
     </w:p>
     <w:p>
-      <w:pPr>
-        <w:pStyle w:val="NoSpacing"/>
-        <w:rPr>
-          <w:rFonts w:ascii="Consolas" w:hAnsi="Consolas"/>
-          <w:sz w:val="17"/>
-        </w:rPr>
-      </w:pPr>
       <w:r>
         <w:rPr>
-          <w:rFonts w:ascii="Consolas" w:hAnsi="Consolas"/>
-          <w:sz w:val="17"/>
-        </w:rPr>
-        <w:t>Process flow:</w:t>
-      </w:r>
-    </w:p>
-    <w:p>
-      <w:pPr>
-        <w:pStyle w:val="NoSpacing"/>
-        <w:jc w:val="center"/>
-      </w:pPr>
-      <w:r>
-        <w:rPr>
-          <w:rFonts w:ascii="Consolas" w:hAnsi="Consolas"/>
           <w:noProof/>
-          <w:sz w:val="17"/>
         </w:rPr>
         <w:lastRenderedPageBreak/>
         <w:drawing>
-          <wp:inline distT="0" distB="0" distL="0" distR="0" wp14:anchorId="39E37666" wp14:editId="1376B853">
-            <wp:extent cx="5038725" cy="7228124"/>
+          <wp:inline distT="0" distB="0" distL="0" distR="0" wp14:anchorId="660AE2D2" wp14:editId="4E88A266">
+            <wp:extent cx="6177915" cy="8865870"/>
             <wp:effectExtent l="0" t="0" r="0" b="0"/>
-            <wp:docPr id="221380548" name="Picture 1"/>
+            <wp:docPr id="1340329557" name="Picture 2"/>
             <wp:cNvGraphicFramePr>
               <a:graphicFrameLocks xmlns:a="http://schemas.openxmlformats.org/drawingml/2006/main" noChangeAspect="1"/>
             </wp:cNvGraphicFramePr>
@@ -1363,7 +1868,7 @@
               <a:graphicData uri="http://schemas.openxmlformats.org/drawingml/2006/picture">
                 <pic:pic xmlns:pic="http://schemas.openxmlformats.org/drawingml/2006/picture">
                   <pic:nvPicPr>
-                    <pic:cNvPr id="0" name="Picture 1"/>
+                    <pic:cNvPr id="0" name="Picture 2"/>
                     <pic:cNvPicPr>
                       <a:picLocks noChangeAspect="1" noChangeArrowheads="1"/>
                     </pic:cNvPicPr>
@@ -1384,7 +1889,7 @@
                   <pic:spPr bwMode="auto">
                     <a:xfrm>
                       <a:off x="0" y="0"/>
-                      <a:ext cx="5044388" cy="7236248"/>
+                      <a:ext cx="6177915" cy="8865870"/>
                     </a:xfrm>
                     <a:prstGeom prst="rect">
                       <a:avLst/>
@@ -1403,9 +1908,10 @@
     </w:p>
     <w:p>
       <w:pPr>
-        <w:pStyle w:val="Heading2"/>
+        <w:pStyle w:val="Heading1"/>
       </w:pPr>
       <w:r>
+        <w:lastRenderedPageBreak/>
         <w:t>New job or missing CaseWare entity</w:t>
       </w:r>
     </w:p>
@@ -1417,15 +1923,17 @@
     <w:p>
       <w:pPr>
         <w:pStyle w:val="NoSpacing"/>
+        <w:ind w:left="360"/>
       </w:pPr>
       <w:r>
         <w:rPr>
           <w:rFonts w:ascii="Consolas" w:hAnsi="Consolas"/>
-          <w:sz w:val="17"/>
+          <w:sz w:val="16"/>
         </w:rPr>
         <w:t>EntityNo = VSKY-{Maconomy job number}</w:t>
       </w:r>
     </w:p>
+    <w:p/>
     <w:p>
       <w:r>
         <w:t>If no matching entity exists, the integration creates the CaseWare entity and its first address. The address is then read back so both the numeric address number and address `CWGuid` can be saved in Maconomy.</w:t>
@@ -1438,25 +1946,25 @@
     </w:p>
     <w:p>
       <w:r>
-        <w:lastRenderedPageBreak/>
         <w:t>After successful creation, the Maconomy `text19` field contains the mapping:</w:t>
       </w:r>
     </w:p>
     <w:p>
       <w:pPr>
         <w:pStyle w:val="NoSpacing"/>
+        <w:ind w:left="360"/>
       </w:pPr>
       <w:r>
         <w:rPr>
           <w:rFonts w:ascii="Consolas" w:hAnsi="Consolas"/>
-          <w:sz w:val="17"/>
+          <w:sz w:val="16"/>
         </w:rPr>
         <w:t>{</w:t>
       </w:r>
       <w:r>
         <w:rPr>
           <w:rFonts w:ascii="Consolas" w:hAnsi="Consolas"/>
-          <w:sz w:val="17"/>
+          <w:sz w:val="16"/>
         </w:rPr>
         <w:br/>
         <w:t xml:space="preserve">  "entityId": "CaseWare entity CWGuid",</w:t>
@@ -1464,7 +1972,7 @@
       <w:r>
         <w:rPr>
           <w:rFonts w:ascii="Consolas" w:hAnsi="Consolas"/>
-          <w:sz w:val="17"/>
+          <w:sz w:val="16"/>
         </w:rPr>
         <w:br/>
         <w:t xml:space="preserve">  "entityNo": "VSKY-job number",</w:t>
@@ -1472,7 +1980,7 @@
       <w:r>
         <w:rPr>
           <w:rFonts w:ascii="Consolas" w:hAnsi="Consolas"/>
-          <w:sz w:val="17"/>
+          <w:sz w:val="16"/>
         </w:rPr>
         <w:br/>
         <w:t xml:space="preserve">  "syncedVersion": "Maconomy version after text19 write",</w:t>
@@ -1480,7 +1988,7 @@
       <w:r>
         <w:rPr>
           <w:rFonts w:ascii="Consolas" w:hAnsi="Consolas"/>
-          <w:sz w:val="17"/>
+          <w:sz w:val="16"/>
         </w:rPr>
         <w:br/>
         <w:t xml:space="preserve">  "addressId": "CaseWare address CWGuid",</w:t>
@@ -1488,7 +1996,7 @@
       <w:r>
         <w:rPr>
           <w:rFonts w:ascii="Consolas" w:hAnsi="Consolas"/>
-          <w:sz w:val="17"/>
+          <w:sz w:val="16"/>
         </w:rPr>
         <w:br/>
         <w:t xml:space="preserve">  "addressNo": "CaseWare address Id",</w:t>
@@ -1496,7 +2004,7 @@
       <w:r>
         <w:rPr>
           <w:rFonts w:ascii="Consolas" w:hAnsi="Consolas"/>
-          <w:sz w:val="17"/>
+          <w:sz w:val="16"/>
         </w:rPr>
         <w:br/>
         <w:t xml:space="preserve">  "lastUpdateOnUTC": "UTC timestamp"</w:t>
@@ -1504,12 +2012,13 @@
       <w:r>
         <w:rPr>
           <w:rFonts w:ascii="Consolas" w:hAnsi="Consolas"/>
-          <w:sz w:val="17"/>
+          <w:sz w:val="16"/>
         </w:rPr>
         <w:br/>
         <w:t>}</w:t>
       </w:r>
     </w:p>
+    <w:p/>
     <w:p>
       <w:r>
         <w:t>The response action is `CREATED`.</w:t>
@@ -1517,7 +2026,7 @@
     </w:p>
     <w:p>
       <w:pPr>
-        <w:pStyle w:val="Heading2"/>
+        <w:pStyle w:val="Heading1"/>
       </w:pPr>
       <w:r>
         <w:t>Existing CaseWare entity</w:t>
@@ -1540,7 +2049,7 @@
     </w:p>
     <w:p>
       <w:pPr>
-        <w:pStyle w:val="Heading2"/>
+        <w:pStyle w:val="Heading1"/>
       </w:pPr>
       <w:r>
         <w:t>Maconomy updates</w:t>
@@ -1564,9 +2073,10 @@
         <w:rPr>
           <w:noProof/>
         </w:rPr>
+        <w:lastRenderedPageBreak/>
         <w:drawing>
-          <wp:inline distT="0" distB="0" distL="0" distR="0" wp14:anchorId="73721DAE" wp14:editId="7BE99F7B">
-            <wp:extent cx="5943600" cy="2900377"/>
+          <wp:inline distT="0" distB="0" distL="0" distR="0" wp14:anchorId="6D6F16A6" wp14:editId="59C4C40E">
+            <wp:extent cx="5852160" cy="2855756"/>
             <wp:effectExtent l="0" t="0" r="0" b="0"/>
             <wp:docPr id="4" name="Picture 4"/>
             <wp:cNvGraphicFramePr>
@@ -1588,7 +2098,7 @@
                   <pic:spPr>
                     <a:xfrm>
                       <a:off x="0" y="0"/>
-                      <a:ext cx="5943600" cy="2900377"/>
+                      <a:ext cx="5852160" cy="2855756"/>
                     </a:xfrm>
                     <a:prstGeom prst="rect">
                       <a:avLst/>
@@ -1606,9 +2116,6 @@
         <w:jc w:val="center"/>
       </w:pPr>
       <w:r>
-        <w:rPr>
-          <w:i/>
-        </w:rPr>
         <w:t>Maconomy jobs list showing text19 mappings</w:t>
       </w:r>
     </w:p>
@@ -1619,13 +2126,12 @@
     </w:p>
     <w:p>
       <w:r>
-        <w:lastRenderedPageBreak/>
         <w:t>Writing `text19` increases the Maconomy version by one. The integration stores the corresponding synchronized version so the next scheduler run can exclude the job until Maconomy reports another change.</w:t>
       </w:r>
     </w:p>
     <w:p>
       <w:pPr>
-        <w:pStyle w:val="Heading2"/>
+        <w:pStyle w:val="Heading1"/>
       </w:pPr>
       <w:r>
         <w:t>Authentication and reliability</w:t>
@@ -1643,7 +2149,7 @@
     </w:p>
     <w:p>
       <w:pPr>
-        <w:pStyle w:val="Heading2"/>
+        <w:pStyle w:val="Heading1"/>
       </w:pPr>
       <w:r>
         <w:t>Status and troubleshooting</w:t>
@@ -1690,7 +2196,7 @@
     </w:p>
     <w:tbl>
       <w:tblPr>
-        <w:tblStyle w:val="LightShading-Accent1"/>
+        <w:tblStyle w:val="TableGrid"/>
         <w:tblW w:w="0" w:type="auto"/>
         <w:tblLook w:val="04A0" w:firstRow="1" w:lastRow="0" w:firstColumn="1" w:lastColumn="0" w:noHBand="0" w:noVBand="1"/>
       </w:tblPr>
@@ -1699,16 +2205,17 @@
         <w:gridCol w:w="5040"/>
       </w:tblGrid>
       <w:tr>
-        <w:trPr>
-          <w:cnfStyle w:val="100000000000" w:firstRow="1" w:lastRow="0" w:firstColumn="0" w:lastColumn="0" w:oddVBand="0" w:evenVBand="0" w:oddHBand="0" w:evenHBand="0" w:firstRowFirstColumn="0" w:firstRowLastColumn="0" w:lastRowFirstColumn="0" w:lastRowLastColumn="0"/>
-        </w:trPr>
         <w:tc>
           <w:tcPr>
-            <w:cnfStyle w:val="001000000000" w:firstRow="0" w:lastRow="0" w:firstColumn="1" w:lastColumn="0" w:oddVBand="0" w:evenVBand="0" w:oddHBand="0" w:evenHBand="0" w:firstRowFirstColumn="0" w:firstRowLastColumn="0" w:lastRowFirstColumn="0" w:lastRowLastColumn="0"/>
             <w:tcW w:w="5040" w:type="dxa"/>
+            <w:shd w:val="clear" w:color="auto" w:fill="D9EAF7"/>
           </w:tcPr>
           <w:p>
             <w:r>
+              <w:rPr>
+                <w:b/>
+                <w:sz w:val="18"/>
+              </w:rPr>
               <w:t>Outcome</w:t>
             </w:r>
           </w:p>
@@ -1716,28 +2223,29 @@
         <w:tc>
           <w:tcPr>
             <w:tcW w:w="5040" w:type="dxa"/>
+            <w:shd w:val="clear" w:color="auto" w:fill="D9EAF7"/>
           </w:tcPr>
           <w:p>
-            <w:pPr>
-              <w:cnfStyle w:val="100000000000" w:firstRow="1" w:lastRow="0" w:firstColumn="0" w:lastColumn="0" w:oddVBand="0" w:evenVBand="0" w:oddHBand="0" w:evenHBand="0" w:firstRowFirstColumn="0" w:firstRowLastColumn="0" w:lastRowFirstColumn="0" w:lastRowLastColumn="0"/>
-            </w:pPr>
             <w:r>
+              <w:rPr>
+                <w:b/>
+                <w:sz w:val="18"/>
+              </w:rPr>
               <w:t>Meaning</w:t>
             </w:r>
           </w:p>
         </w:tc>
       </w:tr>
       <w:tr>
-        <w:trPr>
-          <w:cnfStyle w:val="000000100000" w:firstRow="0" w:lastRow="0" w:firstColumn="0" w:lastColumn="0" w:oddVBand="0" w:evenVBand="0" w:oddHBand="1" w:evenHBand="0" w:firstRowFirstColumn="0" w:firstRowLastColumn="0" w:lastRowFirstColumn="0" w:lastRowLastColumn="0"/>
-        </w:trPr>
         <w:tc>
           <w:tcPr>
-            <w:cnfStyle w:val="001000000000" w:firstRow="0" w:lastRow="0" w:firstColumn="1" w:lastColumn="0" w:oddVBand="0" w:evenVBand="0" w:oddHBand="0" w:evenHBand="0" w:firstRowFirstColumn="0" w:firstRowLastColumn="0" w:lastRowFirstColumn="0" w:lastRowLastColumn="0"/>
             <w:tcW w:w="5040" w:type="dxa"/>
           </w:tcPr>
           <w:p>
             <w:r>
+              <w:rPr>
+                <w:sz w:val="18"/>
+              </w:rPr>
               <w:t>`CREATED`</w:t>
             </w:r>
           </w:p>
@@ -1747,10 +2255,10 @@
             <w:tcW w:w="5040" w:type="dxa"/>
           </w:tcPr>
           <w:p>
-            <w:pPr>
-              <w:cnfStyle w:val="000000100000" w:firstRow="0" w:lastRow="0" w:firstColumn="0" w:lastColumn="0" w:oddVBand="0" w:evenVBand="0" w:oddHBand="1" w:evenHBand="0" w:firstRowFirstColumn="0" w:firstRowLastColumn="0" w:lastRowFirstColumn="0" w:lastRowLastColumn="0"/>
-            </w:pPr>
             <w:r>
+              <w:rPr>
+                <w:sz w:val="18"/>
+              </w:rPr>
               <w:t>CaseWare entity and address were created and mapped.</w:t>
             </w:r>
           </w:p>
@@ -1759,11 +2267,13 @@
       <w:tr>
         <w:tc>
           <w:tcPr>
-            <w:cnfStyle w:val="001000000000" w:firstRow="0" w:lastRow="0" w:firstColumn="1" w:lastColumn="0" w:oddVBand="0" w:evenVBand="0" w:oddHBand="0" w:evenHBand="0" w:firstRowFirstColumn="0" w:firstRowLastColumn="0" w:lastRowFirstColumn="0" w:lastRowLastColumn="0"/>
             <w:tcW w:w="5040" w:type="dxa"/>
           </w:tcPr>
           <w:p>
             <w:r>
+              <w:rPr>
+                <w:sz w:val="18"/>
+              </w:rPr>
               <w:t>`TOUPDATE`</w:t>
             </w:r>
           </w:p>
@@ -1773,26 +2283,25 @@
             <w:tcW w:w="5040" w:type="dxa"/>
           </w:tcPr>
           <w:p>
-            <w:pPr>
-              <w:cnfStyle w:val="000000000000" w:firstRow="0" w:lastRow="0" w:firstColumn="0" w:lastColumn="0" w:oddVBand="0" w:evenVBand="0" w:oddHBand="0" w:evenHBand="0" w:firstRowFirstColumn="0" w:firstRowLastColumn="0" w:lastRowFirstColumn="0" w:lastRowLastColumn="0"/>
-            </w:pPr>
             <w:r>
+              <w:rPr>
+                <w:sz w:val="18"/>
+              </w:rPr>
               <w:t>CaseWare data was updated using the Maconomy job.</w:t>
             </w:r>
           </w:p>
         </w:tc>
       </w:tr>
       <w:tr>
-        <w:trPr>
-          <w:cnfStyle w:val="000000100000" w:firstRow="0" w:lastRow="0" w:firstColumn="0" w:lastColumn="0" w:oddVBand="0" w:evenVBand="0" w:oddHBand="1" w:evenHBand="0" w:firstRowFirstColumn="0" w:firstRowLastColumn="0" w:lastRowFirstColumn="0" w:lastRowLastColumn="0"/>
-        </w:trPr>
         <w:tc>
           <w:tcPr>
-            <w:cnfStyle w:val="001000000000" w:firstRow="0" w:lastRow="0" w:firstColumn="1" w:lastColumn="0" w:oddVBand="0" w:evenVBand="0" w:oddHBand="0" w:evenHBand="0" w:firstRowFirstColumn="0" w:firstRowLastColumn="0" w:lastRowFirstColumn="0" w:lastRowLastColumn="0"/>
             <w:tcW w:w="5040" w:type="dxa"/>
           </w:tcPr>
           <w:p>
             <w:r>
+              <w:rPr>
+                <w:sz w:val="18"/>
+              </w:rPr>
               <w:t>`FAILED`</w:t>
             </w:r>
           </w:p>
@@ -1802,10 +2311,10 @@
             <w:tcW w:w="5040" w:type="dxa"/>
           </w:tcPr>
           <w:p>
-            <w:pPr>
-              <w:cnfStyle w:val="000000100000" w:firstRow="0" w:lastRow="0" w:firstColumn="0" w:lastColumn="0" w:oddVBand="0" w:evenVBand="0" w:oddHBand="1" w:evenHBand="0" w:firstRowFirstColumn="0" w:firstRowLastColumn="0" w:lastRowFirstColumn="0" w:lastRowLastColumn="0"/>
-            </w:pPr>
             <w:r>
+              <w:rPr>
+                <w:sz w:val="18"/>
+              </w:rPr>
               <w:t>The job could not complete; review the error and request log.</w:t>
             </w:r>
           </w:p>
@@ -1820,7 +2329,7 @@
     </w:p>
     <w:p>
       <w:pPr>
-        <w:pStyle w:val="Heading2"/>
+        <w:pStyle w:val="Heading1"/>
       </w:pPr>
       <w:r>
         <w:t>Support sequence</w:t>
@@ -2054,31 +2563,31 @@
       </w:rPr>
     </w:lvl>
   </w:abstractNum>
-  <w:num w:numId="1" w16cid:durableId="1748114579">
+  <w:num w:numId="1" w16cid:durableId="1898122261">
     <w:abstractNumId w:val="8"/>
   </w:num>
-  <w:num w:numId="2" w16cid:durableId="1916545534">
+  <w:num w:numId="2" w16cid:durableId="1872839103">
     <w:abstractNumId w:val="6"/>
   </w:num>
-  <w:num w:numId="3" w16cid:durableId="1434738409">
+  <w:num w:numId="3" w16cid:durableId="530193342">
     <w:abstractNumId w:val="5"/>
   </w:num>
-  <w:num w:numId="4" w16cid:durableId="1259632760">
+  <w:num w:numId="4" w16cid:durableId="1521317272">
     <w:abstractNumId w:val="4"/>
   </w:num>
-  <w:num w:numId="5" w16cid:durableId="823470561">
+  <w:num w:numId="5" w16cid:durableId="2099785860">
     <w:abstractNumId w:val="7"/>
   </w:num>
-  <w:num w:numId="6" w16cid:durableId="1462310999">
+  <w:num w:numId="6" w16cid:durableId="1105611806">
     <w:abstractNumId w:val="3"/>
   </w:num>
-  <w:num w:numId="7" w16cid:durableId="11422797">
+  <w:num w:numId="7" w16cid:durableId="734594406">
     <w:abstractNumId w:val="2"/>
   </w:num>
-  <w:num w:numId="8" w16cid:durableId="1010058992">
+  <w:num w:numId="8" w16cid:durableId="540823138">
     <w:abstractNumId w:val="1"/>
   </w:num>
-  <w:num w:numId="9" w16cid:durableId="854416362">
+  <w:num w:numId="9" w16cid:durableId="100341358">
     <w:abstractNumId w:val="0"/>
   </w:num>
 </w:numbering>
@@ -2497,7 +3006,7 @@
       <w:rFonts w:asciiTheme="majorHAnsi" w:eastAsiaTheme="majorEastAsia" w:hAnsiTheme="majorHAnsi" w:cstheme="majorBidi"/>
       <w:b/>
       <w:bCs/>
-      <w:color w:val="365F91" w:themeColor="accent1" w:themeShade="BF"/>
+      <w:color w:val="1F4E79"/>
       <w:sz w:val="36"/>
       <w:szCs w:val="28"/>
     </w:rPr>
@@ -2521,7 +3030,7 @@
       <w:rFonts w:asciiTheme="majorHAnsi" w:eastAsiaTheme="majorEastAsia" w:hAnsiTheme="majorHAnsi" w:cstheme="majorBidi"/>
       <w:b/>
       <w:bCs/>
-      <w:color w:val="4F81BD" w:themeColor="accent1"/>
+      <w:color w:val="2F75B5"/>
       <w:sz w:val="28"/>
       <w:szCs w:val="26"/>
     </w:rPr>
@@ -2545,7 +3054,7 @@
       <w:rFonts w:asciiTheme="majorHAnsi" w:eastAsiaTheme="majorEastAsia" w:hAnsiTheme="majorHAnsi" w:cstheme="majorBidi"/>
       <w:b/>
       <w:bCs/>
-      <w:color w:val="4F81BD" w:themeColor="accent1"/>
+      <w:color w:val="5B9BD5"/>
       <w:sz w:val="22"/>
     </w:rPr>
   </w:style>
@@ -2827,7 +3336,7 @@
     </w:pPr>
     <w:rPr>
       <w:rFonts w:asciiTheme="majorHAnsi" w:eastAsiaTheme="majorEastAsia" w:hAnsiTheme="majorHAnsi" w:cstheme="majorBidi"/>
-      <w:color w:val="17365D" w:themeColor="text2" w:themeShade="BF"/>
+      <w:color w:val="1F4E79"/>
       <w:spacing w:val="5"/>
       <w:kern w:val="28"/>
       <w:sz w:val="52"/>

</xml_diff>

<commit_message>
feat: implement country code mapping for Maconomy jobs and update documentation
</commit_message>
<xml_diff>
--- a/backend/documentation/CaseWareCloudIntegration/client-caseware-cloud-integration.docx
+++ b/backend/documentation/CaseWareCloudIntegration/client-caseware-cloud-integration.docx
@@ -354,10 +354,7 @@
           </w:tcPr>
           <w:p>
             <w:r>
-              <w:rPr>
-                <w:sz w:val="18"/>
-              </w:rPr>
-              <w:t>Sets the address country.</w:t>
+              <w:t>Sets the address country name and is matched to Maconomy's ISO code for the CaseWare entity and address.</w:t>
             </w:r>
           </w:p>
         </w:tc>
@@ -478,7 +475,7 @@
     <w:p/>
     <w:p>
       <w:r>
-        <w:t>The integration applies the following standard CaseWare values: entity owner `Client`, entity type `A`, organization type `Corporation`, entity country code `US`, and address category `Business`.</w:t>
+        <w:t>The integration applies the following standard CaseWare values: entity owner `Client`, entity type `A`, organization type `Corporation`, and address category `Business`. The entity and address country code comes from the ISO code assigned to the Maconomy country name.</w:t>
       </w:r>
     </w:p>
     <w:p>
@@ -666,6 +663,12 @@
     <w:p>
       <w:r>
         <w:t>The response includes the job details needed to update CaseWare, including the job name, address fields, Maconomy version, and `text19`.</w:t>
+      </w:r>
+    </w:p>
+    <w:p>
+      <w:pPr/>
+      <w:r>
+        <w:t>When at least one job requires creation or update, the integration reads the Maconomy country list once for that request. It matches each job's country name to the corresponding two-letter ISO code and reuses the list for all jobs in the batch. No country-list request is made when there is no work to synchronize.</w:t>
       </w:r>
     </w:p>
     <w:p>
@@ -1186,10 +1189,7 @@
           </w:tcPr>
           <w:p>
             <w:r>
-              <w:rPr>
-                <w:sz w:val="18"/>
-              </w:rPr>
-              <w:t>—</w:t>
+              <w:t>Country (`country`) matched with the Maconomy country list</w:t>
             </w:r>
           </w:p>
         </w:tc>
@@ -1199,10 +1199,7 @@
           </w:tcPr>
           <w:p>
             <w:r>
-              <w:rPr>
-                <w:sz w:val="18"/>
-              </w:rPr>
-              <w:t>`CountryCode = US`</w:t>
+              <w:t>`CountryCode`</w:t>
             </w:r>
           </w:p>
         </w:tc>
@@ -1212,10 +1209,7 @@
           </w:tcPr>
           <w:p>
             <w:r>
-              <w:rPr>
-                <w:sz w:val="18"/>
-              </w:rPr>
-              <w:t>Sets the standard country code during entity creation.</w:t>
+              <w:t>Sets the two-letter ISO country code during entity creation and updates.</w:t>
             </w:r>
           </w:p>
         </w:tc>
@@ -1540,10 +1534,7 @@
           </w:tcPr>
           <w:p>
             <w:r>
-              <w:rPr>
-                <w:sz w:val="18"/>
-              </w:rPr>
-              <w:t>The country value from Maconomy.</w:t>
+              <w:t>The country name from the Maconomy job.</w:t>
             </w:r>
           </w:p>
         </w:tc>
@@ -1585,6 +1576,38 @@
                 <w:sz w:val="18"/>
               </w:rPr>
               <w:t>Identifies the address as a business address.</w:t>
+            </w:r>
+          </w:p>
+        </w:tc>
+      </w:tr>
+      <w:tr>
+        <w:tc>
+          <w:tcPr>
+            <w:tcW w:type="dxa" w:w="3360"/>
+          </w:tcPr>
+          <w:p>
+            <w:r>
+              <w:t>Country (`country`) matched with the Maconomy country list</w:t>
+            </w:r>
+          </w:p>
+        </w:tc>
+        <w:tc>
+          <w:tcPr>
+            <w:tcW w:type="dxa" w:w="3360"/>
+          </w:tcPr>
+          <w:p>
+            <w:r>
+              <w:t>`CountryCode`</w:t>
+            </w:r>
+          </w:p>
+        </w:tc>
+        <w:tc>
+          <w:tcPr>
+            <w:tcW w:type="dxa" w:w="3360"/>
+          </w:tcPr>
+          <w:p>
+            <w:r>
+              <w:t>The corresponding two-letter ISO country code.</w:t>
             </w:r>
           </w:p>
         </w:tc>

</xml_diff>